<commit_message>
Tidy project docs and paper
- Add PROJECT_NOTES.md; update README and notes to point to the live website
- Paper: drop working appendices A and B; rebuild .docx and .pdf (9 pages)
- Archive scripts: replace old absolute paths with repo-relative ones
</commit_message>
<xml_diff>
--- a/paper/Droplet_Spreading_Paper_v2.docx
+++ b/paper/Droplet_Spreading_Paper_v2.docx
@@ -827,7 +827,7 @@
       <w:tr>
         <w:trPr>
           <w:cantSplit/>
-          <w:tblHeader w:val="false"/>
+          <w:tblHeader w:val="off"/>
         </w:trPr>
         <w:tc>
           <w:tcPr>
@@ -1037,7 +1037,7 @@
       <w:tr>
         <w:trPr>
           <w:cantSplit/>
-          <w:tblHeader w:val="false"/>
+          <w:tblHeader w:val="off"/>
         </w:trPr>
         <w:tc>
           <w:tcPr>
@@ -1247,7 +1247,7 @@
       <w:tr>
         <w:trPr>
           <w:cantSplit/>
-          <w:tblHeader w:val="false"/>
+          <w:tblHeader w:val="off"/>
         </w:trPr>
         <w:tc>
           <w:tcPr>
@@ -1457,7 +1457,7 @@
       <w:tr>
         <w:trPr>
           <w:cantSplit/>
-          <w:tblHeader w:val="false"/>
+          <w:tblHeader w:val="off"/>
         </w:trPr>
         <w:tc>
           <w:tcPr>
@@ -1667,7 +1667,7 @@
       <w:tr>
         <w:trPr>
           <w:cantSplit/>
-          <w:tblHeader w:val="false"/>
+          <w:tblHeader w:val="off"/>
         </w:trPr>
         <w:tc>
           <w:tcPr>
@@ -2403,7 +2403,7 @@
       <w:tr>
         <w:trPr>
           <w:cantSplit/>
-          <w:tblHeader w:val="false"/>
+          <w:tblHeader w:val="off"/>
         </w:trPr>
         <w:tc>
           <w:tcPr>
@@ -2749,7 +2749,7 @@
       <w:tr>
         <w:trPr>
           <w:cantSplit/>
-          <w:tblHeader w:val="false"/>
+          <w:tblHeader w:val="off"/>
         </w:trPr>
         <w:tc>
           <w:tcPr>
@@ -3095,7 +3095,7 @@
       <w:tr>
         <w:trPr>
           <w:cantSplit/>
-          <w:tblHeader w:val="false"/>
+          <w:tblHeader w:val="off"/>
         </w:trPr>
         <w:tc>
           <w:tcPr>
@@ -3441,7 +3441,7 @@
       <w:tr>
         <w:trPr>
           <w:cantSplit/>
-          <w:tblHeader w:val="false"/>
+          <w:tblHeader w:val="off"/>
         </w:trPr>
         <w:tc>
           <w:tcPr>
@@ -3787,7 +3787,7 @@
       <w:tr>
         <w:trPr>
           <w:cantSplit/>
-          <w:tblHeader w:val="false"/>
+          <w:tblHeader w:val="off"/>
         </w:trPr>
         <w:tc>
           <w:tcPr>
@@ -4133,7 +4133,7 @@
       <w:tr>
         <w:trPr>
           <w:cantSplit/>
-          <w:tblHeader w:val="false"/>
+          <w:tblHeader w:val="off"/>
         </w:trPr>
         <w:tc>
           <w:tcPr>
@@ -4479,7 +4479,7 @@
       <w:tr>
         <w:trPr>
           <w:cantSplit/>
-          <w:tblHeader w:val="false"/>
+          <w:tblHeader w:val="off"/>
         </w:trPr>
         <w:tc>
           <w:tcPr>
@@ -5594,7 +5594,7 @@
       <w:tr>
         <w:trPr>
           <w:cantSplit/>
-          <w:tblHeader w:val="false"/>
+          <w:tblHeader w:val="off"/>
         </w:trPr>
         <w:tc>
           <w:tcPr>
@@ -5775,7 +5775,7 @@
       <w:tr>
         <w:trPr>
           <w:cantSplit/>
-          <w:tblHeader w:val="false"/>
+          <w:tblHeader w:val="off"/>
         </w:trPr>
         <w:tc>
           <w:tcPr>
@@ -5951,7 +5951,7 @@
       <w:tr>
         <w:trPr>
           <w:cantSplit/>
-          <w:tblHeader w:val="false"/>
+          <w:tblHeader w:val="off"/>
         </w:trPr>
         <w:tc>
           <w:tcPr>
@@ -6127,7 +6127,7 @@
       <w:tr>
         <w:trPr>
           <w:cantSplit/>
-          <w:tblHeader w:val="false"/>
+          <w:tblHeader w:val="off"/>
         </w:trPr>
         <w:tc>
           <w:tcPr>
@@ -6303,7 +6303,7 @@
       <w:tr>
         <w:trPr>
           <w:cantSplit/>
-          <w:tblHeader w:val="false"/>
+          <w:tblHeader w:val="off"/>
         </w:trPr>
         <w:tc>
           <w:tcPr>
@@ -6479,7 +6479,7 @@
       <w:tr>
         <w:trPr>
           <w:cantSplit/>
-          <w:tblHeader w:val="false"/>
+          <w:tblHeader w:val="off"/>
         </w:trPr>
         <w:tc>
           <w:tcPr>
@@ -6655,7 +6655,7 @@
       <w:tr>
         <w:trPr>
           <w:cantSplit/>
-          <w:tblHeader w:val="false"/>
+          <w:tblHeader w:val="off"/>
         </w:trPr>
         <w:tc>
           <w:tcPr>
@@ -6831,7 +6831,7 @@
       <w:tr>
         <w:trPr>
           <w:cantSplit/>
-          <w:tblHeader w:val="false"/>
+          <w:tblHeader w:val="off"/>
         </w:trPr>
         <w:tc>
           <w:tcPr>
@@ -7007,7 +7007,7 @@
       <w:tr>
         <w:trPr>
           <w:cantSplit/>
-          <w:tblHeader w:val="false"/>
+          <w:tblHeader w:val="off"/>
         </w:trPr>
         <w:tc>
           <w:tcPr>
@@ -7183,7 +7183,7 @@
       <w:tr>
         <w:trPr>
           <w:cantSplit/>
-          <w:tblHeader w:val="false"/>
+          <w:tblHeader w:val="off"/>
         </w:trPr>
         <w:tc>
           <w:tcPr>
@@ -7359,7 +7359,7 @@
       <w:tr>
         <w:trPr>
           <w:cantSplit/>
-          <w:tblHeader w:val="false"/>
+          <w:tblHeader w:val="off"/>
         </w:trPr>
         <w:tc>
           <w:tcPr>
@@ -7535,7 +7535,7 @@
       <w:tr>
         <w:trPr>
           <w:cantSplit/>
-          <w:tblHeader w:val="false"/>
+          <w:tblHeader w:val="off"/>
         </w:trPr>
         <w:tc>
           <w:tcPr>
@@ -7711,7 +7711,7 @@
       <w:tr>
         <w:trPr>
           <w:cantSplit/>
-          <w:tblHeader w:val="false"/>
+          <w:tblHeader w:val="off"/>
         </w:trPr>
         <w:tc>
           <w:tcPr>
@@ -8243,7 +8243,7 @@
       <w:tr>
         <w:trPr>
           <w:cantSplit/>
-          <w:tblHeader w:val="false"/>
+          <w:tblHeader w:val="off"/>
         </w:trPr>
         <w:tc>
           <w:tcPr>
@@ -8459,7 +8459,7 @@
       <w:tr>
         <w:trPr>
           <w:cantSplit/>
-          <w:tblHeader w:val="false"/>
+          <w:tblHeader w:val="off"/>
         </w:trPr>
         <w:tc>
           <w:tcPr>
@@ -8669,7 +8669,7 @@
       <w:tr>
         <w:trPr>
           <w:cantSplit/>
-          <w:tblHeader w:val="false"/>
+          <w:tblHeader w:val="off"/>
         </w:trPr>
         <w:tc>
           <w:tcPr>
@@ -8879,7 +8879,7 @@
       <w:tr>
         <w:trPr>
           <w:cantSplit/>
-          <w:tblHeader w:val="false"/>
+          <w:tblHeader w:val="off"/>
         </w:trPr>
         <w:tc>
           <w:tcPr>
@@ -9089,7 +9089,7 @@
       <w:tr>
         <w:trPr>
           <w:cantSplit/>
-          <w:tblHeader w:val="false"/>
+          <w:tblHeader w:val="off"/>
         </w:trPr>
         <w:tc>
           <w:tcPr>
@@ -9299,7 +9299,7 @@
       <w:tr>
         <w:trPr>
           <w:cantSplit/>
-          <w:tblHeader w:val="false"/>
+          <w:tblHeader w:val="off"/>
         </w:trPr>
         <w:tc>
           <w:tcPr>
@@ -9509,7 +9509,7 @@
       <w:tr>
         <w:trPr>
           <w:cantSplit/>
-          <w:tblHeader w:val="false"/>
+          <w:tblHeader w:val="off"/>
         </w:trPr>
         <w:tc>
           <w:tcPr>
@@ -9719,7 +9719,7 @@
       <w:tr>
         <w:trPr>
           <w:cantSplit/>
-          <w:tblHeader w:val="false"/>
+          <w:tblHeader w:val="off"/>
         </w:trPr>
         <w:tc>
           <w:tcPr>
@@ -10056,7 +10056,7 @@
           <wp:inline distT="0" distB="0" distL="0" distR="0">
             <wp:extent cx="5669280" cy="2755442"/>
             <wp:effectExtent t="0" r="0" b="0" l="0"/>
-            <wp:docPr id="1" name="fig2_per_surface.png" descr="Figure 2. RMSE for each held-out surface: baseline GP, GP without surface descriptors, and XGBoost on the same five inputs." title="fig2_per_surface.png"/>
+            <wp:docPr id="2" name="fig2_per_surface.png" descr="Figure 2. RMSE for each held-out surface: baseline GP, GP without surface descriptors, and XGBoost on the same five inputs." title="fig2_per_surface.png"/>
             <wp:cNvGraphicFramePr>
               <a:graphicFrameLocks xmlns:a="http://schemas.openxmlformats.org/drawingml/2006/main" noChangeAspect="1"/>
             </wp:cNvGraphicFramePr>
@@ -10162,7 +10162,7 @@
           <wp:inline distT="0" distB="0" distL="0" distR="0">
             <wp:extent cx="5669280" cy="2998209"/>
             <wp:effectExtent t="0" r="0" b="0" l="0"/>
-            <wp:docPr id="1" name="fig3_parity.png" descr="Figure 3. Predicted against measured βmax for the baseline GP. (a) Each textured surface predicted by a model that never saw it. (b) REF-H predicted by the model fitted on all textured surfaces. Colour: glycerol content." title="fig3_parity.png"/>
+            <wp:docPr id="3" name="fig3_parity.png" descr="Figure 3. Predicted against measured βmax for the baseline GP. (a) Each textured surface predicted by a model that never saw it. (b) REF-H predicted by the model fitted on all textured surfaces. Colour: glycerol content." title="fig3_parity.png"/>
             <wp:cNvGraphicFramePr>
               <a:graphicFrameLocks xmlns:a="http://schemas.openxmlformats.org/drawingml/2006/main" noChangeAspect="1"/>
             </wp:cNvGraphicFramePr>
@@ -10292,7 +10292,7 @@
           <wp:inline distT="0" distB="0" distL="0" distR="0">
             <wp:extent cx="5669280" cy="2477282"/>
             <wp:effectExtent t="0" r="0" b="0" l="0"/>
-            <wp:docPr id="1" name="fig4_by_fluid.png" descr="Figure 4. Baseline GP by fluid. (a) RMSE on unseen textured surfaces (LOSO) and on REF-H. (b) Share of impacts inside the nominal 90% interval." title="fig4_by_fluid.png"/>
+            <wp:docPr id="4" name="fig4_by_fluid.png" descr="Figure 4. Baseline GP by fluid. (a) RMSE on unseen textured surfaces (LOSO) and on REF-H. (b) Share of impacts inside the nominal 90% interval." title="fig4_by_fluid.png"/>
             <wp:cNvGraphicFramePr>
               <a:graphicFrameLocks xmlns:a="http://schemas.openxmlformats.org/drawingml/2006/main" noChangeAspect="1"/>
             </wp:cNvGraphicFramePr>
@@ -10604,7 +10604,7 @@
         <w:jc w:val="both"/>
       </w:pPr>
       <w:r>
-        <w:t xml:space="preserve">The author thanks Može, Jereb, Lovšin, Berce, Zupančič and Golobič for making their dataset public. Analysis code and drafts of this paper were prepared with the assistance of an AI model (Claude, Anthropic); every number in the paper was regenerated from saved result files and checked against them.</w:t>
+        <w:t xml:space="preserve">The author thanks Može, Jereb, Lovšin, Berce, Zupančič and Golobič for making their dataset public. An AI assistant was used to help write analysis code and edit the text; the author designed the study, checked every result against the saved result files, and takes responsibility for the content.</w:t>
       </w:r>
     </w:p>
     <w:p>
@@ -10895,2039 +10895,8 @@
         <w:t xml:space="preserve"> 40 (2017) 913–929.</w:t>
       </w:r>
     </w:p>
-    <w:p>
-      <w:pPr>
-        <w:pageBreakBefore/>
-      </w:pPr>
-    </w:p>
-    <w:p>
-      <w:pPr>
-        <w:pStyle w:val="Heading1"/>
-        <w:keepNext/>
-        <w:spacing w:after="120" w:before="280"/>
-      </w:pPr>
-      <w:r>
-        <w:t xml:space="preserve">Appendix A. Corrections to the draft of 23 September 2026</w:t>
-      </w:r>
-    </w:p>
-    <w:p>
-      <w:pPr>
-        <w:spacing w:after="120" w:before="0" w:line="276"/>
-        <w:jc w:val="both"/>
-      </w:pPr>
-      <w:r>
-        <w:t xml:space="preserve">The earlier draft (Droplet_Impact_Research_Paper.md) and the README.md and pitch_scripts/PITCH.md inside the four-part download of 23 September contain statements that are not supported by the data or result files. None of them should be used. The source of each error is given in brackets.</w:t>
-      </w:r>
-    </w:p>
-    <w:p>
-      <w:pPr>
-        <w:spacing w:after="120" w:before="0" w:line="276"/>
-        <w:jc w:val="both"/>
-      </w:pPr>
-      <w:r>
-        <w:t xml:space="preserve">The pitch script saved in the project (claude/pitch_scripts.md) was re-checked against the result files on 24 September and updated: REF-H is now described as a held-out stress test rather than a blind test, the dataset is credited to Može et al. [4], and the viscosity finding of Section 4.4 is included. Its remaining figures are traceable: Laan R</w:t>
-      </w:r>
-      <w:r>
-        <w:rPr>
-          <w:vertAlign w:val="superscript"/>
-        </w:rPr>
-        <w:t xml:space="preserve">2</w:t>
-      </w:r>
-      <w:r>
-        <w:t xml:space="preserve"> = 0.71 is Eq. (1) with the published A = 1.24 on the textured impacts (with A refitted on held-out surfaces, R</w:t>
-      </w:r>
-      <w:r>
-        <w:rPr>
-          <w:vertAlign w:val="superscript"/>
-        </w:rPr>
-        <w:t xml:space="preserve">2</w:t>
-      </w:r>
-      <w:r>
-        <w:t xml:space="preserve"> = 0.66); 0.043 vs 0.039 is the earlier single-descriptor CNN (macro RMSE), not the v2.1 three-view CNN (0.0384); and 83–97% per-surface coverage refers to the earlier split-conformal intervals (nominal intervals: 84%–96%).</w:t>
-      </w:r>
-    </w:p>
-    <w:tbl>
-      <w:tblPr>
-        <w:tblW w:type="dxa" w:w="9026"/>
-        <w:jc w:val="center"/>
-        <w:tblBorders>
-          <w:top w:val="single" w:color="auto" w:sz="4"/>
-          <w:left w:val="single" w:color="auto" w:sz="4"/>
-          <w:bottom w:val="single" w:color="auto" w:sz="4"/>
-          <w:right w:val="single" w:color="auto" w:sz="4"/>
-          <w:insideH w:val="single" w:color="auto" w:sz="4"/>
-          <w:insideV w:val="single" w:color="auto" w:sz="4"/>
-        </w:tblBorders>
-      </w:tblPr>
-      <w:tblGrid>
-        <w:gridCol w:w="1800"/>
-        <w:gridCol w:w="3500"/>
-        <w:gridCol w:w="3726"/>
-      </w:tblGrid>
-      <w:tr>
-        <w:trPr>
-          <w:cantSplit/>
-          <w:tblHeader/>
-        </w:trPr>
-        <w:tc>
-          <w:tcPr>
-            <w:tcW w:type="dxa" w:w="1800"/>
-            <w:tcBorders>
-              <w:top w:val="single" w:color="999999" w:sz="4"/>
-              <w:left w:val="none" w:color="FFFFFF" w:sz="0"/>
-              <w:bottom w:val="single" w:color="999999" w:sz="4"/>
-              <w:right w:val="none" w:color="FFFFFF" w:sz="0"/>
-            </w:tcBorders>
-            <w:shd w:fill="E8EEF6" w:color="auto" w:val="clear"/>
-            <w:tcMar>
-              <w:top w:type="dxa" w:w="50"/>
-              <w:left w:type="dxa" w:w="90"/>
-              <w:bottom w:type="dxa" w:w="50"/>
-              <w:right w:type="dxa" w:w="90"/>
-            </w:tcMar>
-          </w:tcPr>
-          <w:p>
-            <w:pPr>
-              <w:keepNext/>
-              <w:keepLines/>
-              <w:spacing w:after="0"/>
-              <w:jc w:val="left"/>
-            </w:pPr>
-            <w:r>
-              <w:rPr>
-                <w:b/>
-                <w:bCs/>
-                <w:sz w:val="18"/>
-                <w:szCs w:val="18"/>
-              </w:rPr>
-              <w:t xml:space="preserve">Item</w:t>
-            </w:r>
-          </w:p>
-        </w:tc>
-        <w:tc>
-          <w:tcPr>
-            <w:tcW w:type="dxa" w:w="3500"/>
-            <w:tcBorders>
-              <w:top w:val="single" w:color="999999" w:sz="4"/>
-              <w:left w:val="none" w:color="FFFFFF" w:sz="0"/>
-              <w:bottom w:val="single" w:color="999999" w:sz="4"/>
-              <w:right w:val="none" w:color="FFFFFF" w:sz="0"/>
-            </w:tcBorders>
-            <w:shd w:fill="E8EEF6" w:color="auto" w:val="clear"/>
-            <w:tcMar>
-              <w:top w:type="dxa" w:w="50"/>
-              <w:left w:type="dxa" w:w="90"/>
-              <w:bottom w:type="dxa" w:w="50"/>
-              <w:right w:type="dxa" w:w="90"/>
-            </w:tcMar>
-          </w:tcPr>
-          <w:p>
-            <w:pPr>
-              <w:keepNext/>
-              <w:keepLines/>
-              <w:spacing w:after="0"/>
-              <w:jc w:val="left"/>
-            </w:pPr>
-            <w:r>
-              <w:rPr>
-                <w:b/>
-                <w:bCs/>
-                <w:sz w:val="18"/>
-                <w:szCs w:val="18"/>
-              </w:rPr>
-              <w:t xml:space="preserve">Draft of 23 Sept</w:t>
-            </w:r>
-          </w:p>
-        </w:tc>
-        <w:tc>
-          <w:tcPr>
-            <w:tcW w:type="dxa" w:w="3726"/>
-            <w:tcBorders>
-              <w:top w:val="single" w:color="999999" w:sz="4"/>
-              <w:left w:val="none" w:color="FFFFFF" w:sz="0"/>
-              <w:bottom w:val="single" w:color="999999" w:sz="4"/>
-              <w:right w:val="none" w:color="FFFFFF" w:sz="0"/>
-            </w:tcBorders>
-            <w:shd w:fill="E8EEF6" w:color="auto" w:val="clear"/>
-            <w:tcMar>
-              <w:top w:type="dxa" w:w="50"/>
-              <w:left w:type="dxa" w:w="90"/>
-              <w:bottom w:type="dxa" w:w="50"/>
-              <w:right w:type="dxa" w:w="90"/>
-            </w:tcMar>
-          </w:tcPr>
-          <w:p>
-            <w:pPr>
-              <w:keepNext/>
-              <w:keepLines/>
-              <w:spacing w:after="0"/>
-              <w:jc w:val="left"/>
-            </w:pPr>
-            <w:r>
-              <w:rPr>
-                <w:b/>
-                <w:bCs/>
-                <w:sz w:val="18"/>
-                <w:szCs w:val="18"/>
-              </w:rPr>
-              <w:t xml:space="preserve">Correct</w:t>
-            </w:r>
-          </w:p>
-        </w:tc>
-      </w:tr>
-      <w:tr>
-        <w:trPr>
-          <w:cantSplit/>
-          <w:tblHeader w:val="false"/>
-        </w:trPr>
-        <w:tc>
-          <w:tcPr>
-            <w:tcW w:type="dxa" w:w="1800"/>
-            <w:tcBorders>
-              <w:top w:val="none" w:color="FFFFFF" w:sz="0"/>
-              <w:left w:val="none" w:color="FFFFFF" w:sz="0"/>
-              <w:bottom w:val="single" w:color="999999" w:sz="4"/>
-              <w:right w:val="none" w:color="FFFFFF" w:sz="0"/>
-            </w:tcBorders>
-            <w:tcMar>
-              <w:top w:type="dxa" w:w="50"/>
-              <w:left w:type="dxa" w:w="90"/>
-              <w:bottom w:type="dxa" w:w="50"/>
-              <w:right w:type="dxa" w:w="90"/>
-            </w:tcMar>
-          </w:tcPr>
-          <w:p>
-            <w:pPr>
-              <w:keepNext/>
-              <w:keepLines/>
-              <w:spacing w:after="0"/>
-              <w:jc w:val="left"/>
-            </w:pPr>
-            <w:r>
-              <w:rPr>
-                <w:b w:val="false"/>
-                <w:bCs w:val="false"/>
-                <w:sz w:val="18"/>
-                <w:szCs w:val="18"/>
-              </w:rPr>
-              <w:t xml:space="preserve">Authorship of data</w:t>
-            </w:r>
-          </w:p>
-        </w:tc>
-        <w:tc>
-          <w:tcPr>
-            <w:tcW w:type="dxa" w:w="3500"/>
-            <w:tcBorders>
-              <w:top w:val="none" w:color="FFFFFF" w:sz="0"/>
-              <w:left w:val="none" w:color="FFFFFF" w:sz="0"/>
-              <w:bottom w:val="single" w:color="999999" w:sz="4"/>
-              <w:right w:val="none" w:color="FFFFFF" w:sz="0"/>
-            </w:tcBorders>
-            <w:tcMar>
-              <w:top w:type="dxa" w:w="50"/>
-              <w:left w:type="dxa" w:w="90"/>
-              <w:bottom w:type="dxa" w:w="50"/>
-              <w:right w:type="dxa" w:w="90"/>
-            </w:tcMar>
-          </w:tcPr>
-          <w:p>
-            <w:pPr>
-              <w:keepNext/>
-              <w:keepLines/>
-              <w:spacing w:after="0"/>
-              <w:jc w:val="left"/>
-            </w:pPr>
-            <w:r>
-              <w:rPr>
-                <w:b w:val="false"/>
-                <w:bCs w:val="false"/>
-                <w:sz w:val="18"/>
-                <w:szCs w:val="18"/>
-              </w:rPr>
-              <w:t xml:space="preserve">Data Collection section presents the experiments as the author's own: femtosecond laser, 25 kHz camera, manual SEM segmentation (draft); "We measured 1,498 impacts" (PITCH.md)</w:t>
-            </w:r>
-          </w:p>
-        </w:tc>
-        <w:tc>
-          <w:tcPr>
-            <w:tcW w:type="dxa" w:w="3726"/>
-            <w:tcBorders>
-              <w:top w:val="none" w:color="FFFFFF" w:sz="0"/>
-              <w:left w:val="none" w:color="FFFFFF" w:sz="0"/>
-              <w:bottom w:val="single" w:color="999999" w:sz="4"/>
-              <w:right w:val="none" w:color="FFFFFF" w:sz="0"/>
-            </w:tcBorders>
-            <w:tcMar>
-              <w:top w:type="dxa" w:w="50"/>
-              <w:left w:type="dxa" w:w="90"/>
-              <w:bottom w:type="dxa" w:w="50"/>
-              <w:right w:type="dxa" w:w="90"/>
-            </w:tcMar>
-          </w:tcPr>
-          <w:p>
-            <w:pPr>
-              <w:keepNext/>
-              <w:keepLines/>
-              <w:spacing w:after="0"/>
-              <w:jc w:val="left"/>
-            </w:pPr>
-            <w:r>
-              <w:rPr>
-                <w:b w:val="false"/>
-                <w:bCs w:val="false"/>
-                <w:sz w:val="18"/>
-                <w:szCs w:val="18"/>
-              </w:rPr>
-              <w:t xml:space="preserve">Public dataset of Može et al. [4]: nanosecond fibre laser, 5,000 fps. No new experiments.</w:t>
-            </w:r>
-          </w:p>
-        </w:tc>
-      </w:tr>
-      <w:tr>
-        <w:trPr>
-          <w:cantSplit/>
-          <w:tblHeader w:val="false"/>
-        </w:trPr>
-        <w:tc>
-          <w:tcPr>
-            <w:tcW w:type="dxa" w:w="1800"/>
-            <w:tcBorders>
-              <w:top w:val="none" w:color="FFFFFF" w:sz="0"/>
-              <w:left w:val="none" w:color="FFFFFF" w:sz="0"/>
-              <w:bottom w:val="single" w:color="999999" w:sz="4"/>
-              <w:right w:val="none" w:color="FFFFFF" w:sz="0"/>
-            </w:tcBorders>
-            <w:tcMar>
-              <w:top w:type="dxa" w:w="50"/>
-              <w:left w:type="dxa" w:w="90"/>
-              <w:bottom w:type="dxa" w:w="50"/>
-              <w:right w:type="dxa" w:w="90"/>
-            </w:tcMar>
-          </w:tcPr>
-          <w:p>
-            <w:pPr>
-              <w:keepNext/>
-              <w:keepLines/>
-              <w:spacing w:after="0"/>
-              <w:jc w:val="left"/>
-            </w:pPr>
-            <w:r>
-              <w:rPr>
-                <w:b w:val="false"/>
-                <w:bCs w:val="false"/>
-                <w:sz w:val="18"/>
-                <w:szCs w:val="18"/>
-              </w:rPr>
-              <w:t xml:space="preserve">REF-H RMSE</w:t>
-            </w:r>
-          </w:p>
-        </w:tc>
-        <w:tc>
-          <w:tcPr>
-            <w:tcW w:type="dxa" w:w="3500"/>
-            <w:tcBorders>
-              <w:top w:val="none" w:color="FFFFFF" w:sz="0"/>
-              <w:left w:val="none" w:color="FFFFFF" w:sz="0"/>
-              <w:bottom w:val="single" w:color="999999" w:sz="4"/>
-              <w:right w:val="none" w:color="FFFFFF" w:sz="0"/>
-            </w:tcBorders>
-            <w:tcMar>
-              <w:top w:type="dxa" w:w="50"/>
-              <w:left w:type="dxa" w:w="90"/>
-              <w:bottom w:type="dxa" w:w="50"/>
-              <w:right w:type="dxa" w:w="90"/>
-            </w:tcMar>
-          </w:tcPr>
-          <w:p>
-            <w:pPr>
-              <w:keepNext/>
-              <w:keepLines/>
-              <w:spacing w:after="0"/>
-              <w:jc w:val="left"/>
-            </w:pPr>
-            <w:r>
-              <w:rPr>
-                <w:b w:val="false"/>
-                <w:bCs w:val="false"/>
-                <w:sz w:val="18"/>
-                <w:szCs w:val="18"/>
-              </w:rPr>
-              <w:t xml:space="preserve">0.0394</w:t>
-            </w:r>
-          </w:p>
-        </w:tc>
-        <w:tc>
-          <w:tcPr>
-            <w:tcW w:type="dxa" w:w="3726"/>
-            <w:tcBorders>
-              <w:top w:val="none" w:color="FFFFFF" w:sz="0"/>
-              <w:left w:val="none" w:color="FFFFFF" w:sz="0"/>
-              <w:bottom w:val="single" w:color="999999" w:sz="4"/>
-              <w:right w:val="none" w:color="FFFFFF" w:sz="0"/>
-            </w:tcBorders>
-            <w:tcMar>
-              <w:top w:type="dxa" w:w="50"/>
-              <w:left w:type="dxa" w:w="90"/>
-              <w:bottom w:type="dxa" w:w="50"/>
-              <w:right w:type="dxa" w:w="90"/>
-            </w:tcMar>
-          </w:tcPr>
-          <w:p>
-            <w:pPr>
-              <w:keepNext/>
-              <w:keepLines/>
-              <w:spacing w:after="0"/>
-              <w:jc w:val="left"/>
-            </w:pPr>
-            <w:r>
-              <w:rPr>
-                <w:b w:val="false"/>
-                <w:bCs w:val="false"/>
-                <w:sz w:val="18"/>
-                <w:szCs w:val="18"/>
-              </w:rPr>
-              <w:t xml:space="preserve">0.0591</w:t>
-            </w:r>
-          </w:p>
-        </w:tc>
-      </w:tr>
-      <w:tr>
-        <w:trPr>
-          <w:cantSplit/>
-          <w:tblHeader w:val="false"/>
-        </w:trPr>
-        <w:tc>
-          <w:tcPr>
-            <w:tcW w:type="dxa" w:w="1800"/>
-            <w:tcBorders>
-              <w:top w:val="none" w:color="FFFFFF" w:sz="0"/>
-              <w:left w:val="none" w:color="FFFFFF" w:sz="0"/>
-              <w:bottom w:val="single" w:color="999999" w:sz="4"/>
-              <w:right w:val="none" w:color="FFFFFF" w:sz="0"/>
-            </w:tcBorders>
-            <w:tcMar>
-              <w:top w:type="dxa" w:w="50"/>
-              <w:left w:type="dxa" w:w="90"/>
-              <w:bottom w:type="dxa" w:w="50"/>
-              <w:right w:type="dxa" w:w="90"/>
-            </w:tcMar>
-          </w:tcPr>
-          <w:p>
-            <w:pPr>
-              <w:keepNext/>
-              <w:keepLines/>
-              <w:spacing w:after="0"/>
-              <w:jc w:val="left"/>
-            </w:pPr>
-            <w:r>
-              <w:rPr>
-                <w:b w:val="false"/>
-                <w:bCs w:val="false"/>
-                <w:sz w:val="18"/>
-                <w:szCs w:val="18"/>
-              </w:rPr>
-              <w:t xml:space="preserve">β</w:t>
-            </w:r>
-            <w:r>
-              <w:rPr>
-                <w:b w:val="false"/>
-                <w:bCs w:val="false"/>
-                <w:sz w:val="18"/>
-                <w:szCs w:val="18"/>
-                <w:vertAlign w:val="subscript"/>
-              </w:rPr>
-              <w:t xml:space="preserve">max</w:t>
-            </w:r>
-            <w:r>
-              <w:rPr>
-                <w:b w:val="false"/>
-                <w:bCs w:val="false"/>
-                <w:sz w:val="18"/>
-                <w:szCs w:val="18"/>
-              </w:rPr>
-              <w:t xml:space="preserve"> range</w:t>
-            </w:r>
-          </w:p>
-        </w:tc>
-        <w:tc>
-          <w:tcPr>
-            <w:tcW w:type="dxa" w:w="3500"/>
-            <w:tcBorders>
-              <w:top w:val="none" w:color="FFFFFF" w:sz="0"/>
-              <w:left w:val="none" w:color="FFFFFF" w:sz="0"/>
-              <w:bottom w:val="single" w:color="999999" w:sz="4"/>
-              <w:right w:val="none" w:color="FFFFFF" w:sz="0"/>
-            </w:tcBorders>
-            <w:tcMar>
-              <w:top w:type="dxa" w:w="50"/>
-              <w:left w:type="dxa" w:w="90"/>
-              <w:bottom w:type="dxa" w:w="50"/>
-              <w:right w:type="dxa" w:w="90"/>
-            </w:tcMar>
-          </w:tcPr>
-          <w:p>
-            <w:pPr>
-              <w:keepNext/>
-              <w:keepLines/>
-              <w:spacing w:after="0"/>
-              <w:jc w:val="left"/>
-            </w:pPr>
-            <w:r>
-              <w:rPr>
-                <w:b w:val="false"/>
-                <w:bCs w:val="false"/>
-                <w:sz w:val="18"/>
-                <w:szCs w:val="18"/>
-              </w:rPr>
-              <w:t xml:space="preserve">0.2–1.0</w:t>
-            </w:r>
-          </w:p>
-        </w:tc>
-        <w:tc>
-          <w:tcPr>
-            <w:tcW w:type="dxa" w:w="3726"/>
-            <w:tcBorders>
-              <w:top w:val="none" w:color="FFFFFF" w:sz="0"/>
-              <w:left w:val="none" w:color="FFFFFF" w:sz="0"/>
-              <w:bottom w:val="single" w:color="999999" w:sz="4"/>
-              <w:right w:val="none" w:color="FFFFFF" w:sz="0"/>
-            </w:tcBorders>
-            <w:tcMar>
-              <w:top w:type="dxa" w:w="50"/>
-              <w:left w:type="dxa" w:w="90"/>
-              <w:bottom w:type="dxa" w:w="50"/>
-              <w:right w:type="dxa" w:w="90"/>
-            </w:tcMar>
-          </w:tcPr>
-          <w:p>
-            <w:pPr>
-              <w:keepNext/>
-              <w:keepLines/>
-              <w:spacing w:after="0"/>
-              <w:jc w:val="left"/>
-            </w:pPr>
-            <w:r>
-              <w:rPr>
-                <w:b w:val="false"/>
-                <w:bCs w:val="false"/>
-                <w:sz w:val="18"/>
-                <w:szCs w:val="18"/>
-              </w:rPr>
-              <w:t xml:space="preserve">1.44–3.34</w:t>
-            </w:r>
-          </w:p>
-        </w:tc>
-      </w:tr>
-      <w:tr>
-        <w:trPr>
-          <w:cantSplit/>
-          <w:tblHeader w:val="false"/>
-        </w:trPr>
-        <w:tc>
-          <w:tcPr>
-            <w:tcW w:type="dxa" w:w="1800"/>
-            <w:tcBorders>
-              <w:top w:val="none" w:color="FFFFFF" w:sz="0"/>
-              <w:left w:val="none" w:color="FFFFFF" w:sz="0"/>
-              <w:bottom w:val="single" w:color="999999" w:sz="4"/>
-              <w:right w:val="none" w:color="FFFFFF" w:sz="0"/>
-            </w:tcBorders>
-            <w:tcMar>
-              <w:top w:type="dxa" w:w="50"/>
-              <w:left w:type="dxa" w:w="90"/>
-              <w:bottom w:type="dxa" w:w="50"/>
-              <w:right w:type="dxa" w:w="90"/>
-            </w:tcMar>
-          </w:tcPr>
-          <w:p>
-            <w:pPr>
-              <w:keepNext/>
-              <w:keepLines/>
-              <w:spacing w:after="0"/>
-              <w:jc w:val="left"/>
-            </w:pPr>
-            <w:r>
-              <w:rPr>
-                <w:b w:val="false"/>
-                <w:bCs w:val="false"/>
-                <w:sz w:val="18"/>
-                <w:szCs w:val="18"/>
-              </w:rPr>
-              <w:t xml:space="preserve">Surfaces</w:t>
-            </w:r>
-          </w:p>
-        </w:tc>
-        <w:tc>
-          <w:tcPr>
-            <w:tcW w:type="dxa" w:w="3500"/>
-            <w:tcBorders>
-              <w:top w:val="none" w:color="FFFFFF" w:sz="0"/>
-              <w:left w:val="none" w:color="FFFFFF" w:sz="0"/>
-              <w:bottom w:val="single" w:color="999999" w:sz="4"/>
-              <w:right w:val="none" w:color="FFFFFF" w:sz="0"/>
-            </w:tcBorders>
-            <w:tcMar>
-              <w:top w:type="dxa" w:w="50"/>
-              <w:left w:type="dxa" w:w="90"/>
-              <w:bottom w:type="dxa" w:w="50"/>
-              <w:right w:type="dxa" w:w="90"/>
-            </w:tcMar>
-          </w:tcPr>
-          <w:p>
-            <w:pPr>
-              <w:keepNext/>
-              <w:keepLines/>
-              <w:spacing w:after="0"/>
-              <w:jc w:val="left"/>
-            </w:pPr>
-            <w:r>
-              <w:rPr>
-                <w:b w:val="false"/>
-                <w:bCs w:val="false"/>
-                <w:sz w:val="18"/>
-                <w:szCs w:val="18"/>
-              </w:rPr>
-              <w:t xml:space="preserve">Included "D1200"</w:t>
-            </w:r>
-          </w:p>
-        </w:tc>
-        <w:tc>
-          <w:tcPr>
-            <w:tcW w:type="dxa" w:w="3726"/>
-            <w:tcBorders>
-              <w:top w:val="none" w:color="FFFFFF" w:sz="0"/>
-              <w:left w:val="none" w:color="FFFFFF" w:sz="0"/>
-              <w:bottom w:val="single" w:color="999999" w:sz="4"/>
-              <w:right w:val="none" w:color="FFFFFF" w:sz="0"/>
-            </w:tcBorders>
-            <w:tcMar>
-              <w:top w:type="dxa" w:w="50"/>
-              <w:left w:type="dxa" w:w="90"/>
-              <w:bottom w:type="dxa" w:w="50"/>
-              <w:right w:type="dxa" w:w="90"/>
-            </w:tcMar>
-          </w:tcPr>
-          <w:p>
-            <w:pPr>
-              <w:keepNext/>
-              <w:keepLines/>
-              <w:spacing w:after="0"/>
-              <w:jc w:val="left"/>
-            </w:pPr>
-            <w:r>
-              <w:rPr>
-                <w:b w:val="false"/>
-                <w:bCs w:val="false"/>
-                <w:sz w:val="18"/>
-                <w:szCs w:val="18"/>
-              </w:rPr>
-              <w:t xml:space="preserve">S50–S800 and D50–D800; no D1200</w:t>
-            </w:r>
-          </w:p>
-        </w:tc>
-      </w:tr>
-      <w:tr>
-        <w:trPr>
-          <w:cantSplit/>
-          <w:tblHeader w:val="false"/>
-        </w:trPr>
-        <w:tc>
-          <w:tcPr>
-            <w:tcW w:type="dxa" w:w="1800"/>
-            <w:tcBorders>
-              <w:top w:val="none" w:color="FFFFFF" w:sz="0"/>
-              <w:left w:val="none" w:color="FFFFFF" w:sz="0"/>
-              <w:bottom w:val="single" w:color="999999" w:sz="4"/>
-              <w:right w:val="none" w:color="FFFFFF" w:sz="0"/>
-            </w:tcBorders>
-            <w:tcMar>
-              <w:top w:type="dxa" w:w="50"/>
-              <w:left w:type="dxa" w:w="90"/>
-              <w:bottom w:type="dxa" w:w="50"/>
-              <w:right w:type="dxa" w:w="90"/>
-            </w:tcMar>
-          </w:tcPr>
-          <w:p>
-            <w:pPr>
-              <w:keepNext/>
-              <w:keepLines/>
-              <w:spacing w:after="0"/>
-              <w:jc w:val="left"/>
-            </w:pPr>
-            <w:r>
-              <w:rPr>
-                <w:b w:val="false"/>
-                <w:bCs w:val="false"/>
-                <w:sz w:val="18"/>
-                <w:szCs w:val="18"/>
-              </w:rPr>
-              <w:t xml:space="preserve">Descriptors</w:t>
-            </w:r>
-          </w:p>
-        </w:tc>
-        <w:tc>
-          <w:tcPr>
-            <w:tcW w:type="dxa" w:w="3500"/>
-            <w:tcBorders>
-              <w:top w:val="none" w:color="FFFFFF" w:sz="0"/>
-              <w:left w:val="none" w:color="FFFFFF" w:sz="0"/>
-              <w:bottom w:val="single" w:color="999999" w:sz="4"/>
-              <w:right w:val="none" w:color="FFFFFF" w:sz="0"/>
-            </w:tcBorders>
-            <w:tcMar>
-              <w:top w:type="dxa" w:w="50"/>
-              <w:left w:type="dxa" w:w="90"/>
-              <w:bottom w:type="dxa" w:w="50"/>
-              <w:right w:type="dxa" w:w="90"/>
-            </w:tcMar>
-          </w:tcPr>
-          <w:p>
-            <w:pPr>
-              <w:keepNext/>
-              <w:keepLines/>
-              <w:spacing w:after="0"/>
-              <w:jc w:val="left"/>
-            </w:pPr>
-            <w:r>
-              <w:rPr>
-                <w:b w:val="false"/>
-                <w:bCs w:val="false"/>
-                <w:sz w:val="18"/>
-                <w:szCs w:val="18"/>
-              </w:rPr>
-              <w:t xml:space="preserve">φ 0.3–0.8 and V</w:t>
-            </w:r>
-            <w:r>
-              <w:rPr>
-                <w:b w:val="false"/>
-                <w:bCs w:val="false"/>
-                <w:sz w:val="18"/>
-                <w:szCs w:val="18"/>
-                <w:vertAlign w:val="subscript"/>
-              </w:rPr>
-              <w:t xml:space="preserve">tex</w:t>
-            </w:r>
-            <w:r>
-              <w:rPr>
-                <w:b w:val="false"/>
-                <w:bCs w:val="false"/>
-                <w:sz w:val="18"/>
-                <w:szCs w:val="18"/>
-              </w:rPr>
-              <w:t xml:space="preserve"> 50–800 µm</w:t>
-            </w:r>
-            <w:r>
-              <w:rPr>
-                <w:b w:val="false"/>
-                <w:bCs w:val="false"/>
-                <w:sz w:val="18"/>
-                <w:szCs w:val="18"/>
-                <w:vertAlign w:val="superscript"/>
-              </w:rPr>
-              <w:t xml:space="preserve">3</w:t>
-            </w:r>
-            <w:r>
-              <w:rPr>
-                <w:b w:val="false"/>
-                <w:bCs w:val="false"/>
-                <w:sz w:val="18"/>
-                <w:szCs w:val="18"/>
-              </w:rPr>
-              <w:t xml:space="preserve">, "measured from SEM"</w:t>
-            </w:r>
-          </w:p>
-        </w:tc>
-        <w:tc>
-          <w:tcPr>
-            <w:tcW w:type="dxa" w:w="3726"/>
-            <w:tcBorders>
-              <w:top w:val="none" w:color="FFFFFF" w:sz="0"/>
-              <w:left w:val="none" w:color="FFFFFF" w:sz="0"/>
-              <w:bottom w:val="single" w:color="999999" w:sz="4"/>
-              <w:right w:val="none" w:color="FFFFFF" w:sz="0"/>
-            </w:tcBorders>
-            <w:tcMar>
-              <w:top w:type="dxa" w:w="50"/>
-              <w:left w:type="dxa" w:w="90"/>
-              <w:bottom w:type="dxa" w:w="50"/>
-              <w:right w:type="dxa" w:w="90"/>
-            </w:tcMar>
-          </w:tcPr>
-          <w:p>
-            <w:pPr>
-              <w:keepNext/>
-              <w:keepLines/>
-              <w:spacing w:after="0"/>
-              <w:jc w:val="left"/>
-            </w:pPr>
-            <w:r>
-              <w:rPr>
-                <w:b w:val="false"/>
-                <w:bCs w:val="false"/>
-                <w:sz w:val="18"/>
-                <w:szCs w:val="18"/>
-              </w:rPr>
-              <w:t xml:space="preserve">φ 0.01–0.93, V</w:t>
-            </w:r>
-            <w:r>
-              <w:rPr>
-                <w:b w:val="false"/>
-                <w:bCs w:val="false"/>
-                <w:sz w:val="18"/>
-                <w:szCs w:val="18"/>
-                <w:vertAlign w:val="subscript"/>
-              </w:rPr>
-              <w:t xml:space="preserve">tex</w:t>
-            </w:r>
-            <w:r>
-              <w:rPr>
-                <w:b w:val="false"/>
-                <w:bCs w:val="false"/>
-                <w:sz w:val="18"/>
-                <w:szCs w:val="18"/>
-              </w:rPr>
-              <w:t xml:space="preserve"> 0.44–24.75 µm; geometric proxies with fixed track widths</w:t>
-            </w:r>
-          </w:p>
-        </w:tc>
-      </w:tr>
-      <w:tr>
-        <w:trPr>
-          <w:cantSplit/>
-          <w:tblHeader w:val="false"/>
-        </w:trPr>
-        <w:tc>
-          <w:tcPr>
-            <w:tcW w:type="dxa" w:w="1800"/>
-            <w:tcBorders>
-              <w:top w:val="none" w:color="FFFFFF" w:sz="0"/>
-              <w:left w:val="none" w:color="FFFFFF" w:sz="0"/>
-              <w:bottom w:val="single" w:color="999999" w:sz="4"/>
-              <w:right w:val="none" w:color="FFFFFF" w:sz="0"/>
-            </w:tcBorders>
-            <w:tcMar>
-              <w:top w:type="dxa" w:w="50"/>
-              <w:left w:type="dxa" w:w="90"/>
-              <w:bottom w:type="dxa" w:w="50"/>
-              <w:right w:type="dxa" w:w="90"/>
-            </w:tcMar>
-          </w:tcPr>
-          <w:p>
-            <w:pPr>
-              <w:keepNext/>
-              <w:keepLines/>
-              <w:spacing w:after="0"/>
-              <w:jc w:val="left"/>
-            </w:pPr>
-            <w:r>
-              <w:rPr>
-                <w:b w:val="false"/>
-                <w:bCs w:val="false"/>
-                <w:sz w:val="18"/>
-                <w:szCs w:val="18"/>
-              </w:rPr>
-              <w:t xml:space="preserve">Kernel and logs</w:t>
-            </w:r>
-          </w:p>
-        </w:tc>
-        <w:tc>
-          <w:tcPr>
-            <w:tcW w:type="dxa" w:w="3500"/>
-            <w:tcBorders>
-              <w:top w:val="none" w:color="FFFFFF" w:sz="0"/>
-              <w:left w:val="none" w:color="FFFFFF" w:sz="0"/>
-              <w:bottom w:val="single" w:color="999999" w:sz="4"/>
-              <w:right w:val="none" w:color="FFFFFF" w:sz="0"/>
-            </w:tcBorders>
-            <w:tcMar>
-              <w:top w:type="dxa" w:w="50"/>
-              <w:left w:type="dxa" w:w="90"/>
-              <w:bottom w:type="dxa" w:w="50"/>
-              <w:right w:type="dxa" w:w="90"/>
-            </w:tcMar>
-          </w:tcPr>
-          <w:p>
-            <w:pPr>
-              <w:keepNext/>
-              <w:keepLines/>
-              <w:spacing w:after="0"/>
-              <w:jc w:val="left"/>
-            </w:pPr>
-            <w:r>
-              <w:rPr>
-                <w:b w:val="false"/>
-                <w:bCs w:val="false"/>
-                <w:sz w:val="18"/>
-                <w:szCs w:val="18"/>
-              </w:rPr>
-              <w:t xml:space="preserve">Matérn 5/2, base-10 logs</w:t>
-            </w:r>
-          </w:p>
-        </w:tc>
-        <w:tc>
-          <w:tcPr>
-            <w:tcW w:type="dxa" w:w="3726"/>
-            <w:tcBorders>
-              <w:top w:val="none" w:color="FFFFFF" w:sz="0"/>
-              <w:left w:val="none" w:color="FFFFFF" w:sz="0"/>
-              <w:bottom w:val="single" w:color="999999" w:sz="4"/>
-              <w:right w:val="none" w:color="FFFFFF" w:sz="0"/>
-            </w:tcBorders>
-            <w:tcMar>
-              <w:top w:type="dxa" w:w="50"/>
-              <w:left w:type="dxa" w:w="90"/>
-              <w:bottom w:type="dxa" w:w="50"/>
-              <w:right w:type="dxa" w:w="90"/>
-            </w:tcMar>
-          </w:tcPr>
-          <w:p>
-            <w:pPr>
-              <w:keepNext/>
-              <w:keepLines/>
-              <w:spacing w:after="0"/>
-              <w:jc w:val="left"/>
-            </w:pPr>
-            <w:r>
-              <w:rPr>
-                <w:b w:val="false"/>
-                <w:bCs w:val="false"/>
-                <w:sz w:val="18"/>
-                <w:szCs w:val="18"/>
-              </w:rPr>
-              <w:t xml:space="preserve">Matérn 3/2, natural logs</w:t>
-            </w:r>
-          </w:p>
-        </w:tc>
-      </w:tr>
-      <w:tr>
-        <w:trPr>
-          <w:cantSplit/>
-          <w:tblHeader w:val="false"/>
-        </w:trPr>
-        <w:tc>
-          <w:tcPr>
-            <w:tcW w:type="dxa" w:w="1800"/>
-            <w:tcBorders>
-              <w:top w:val="none" w:color="FFFFFF" w:sz="0"/>
-              <w:left w:val="none" w:color="FFFFFF" w:sz="0"/>
-              <w:bottom w:val="single" w:color="999999" w:sz="4"/>
-              <w:right w:val="none" w:color="FFFFFF" w:sz="0"/>
-            </w:tcBorders>
-            <w:tcMar>
-              <w:top w:type="dxa" w:w="50"/>
-              <w:left w:type="dxa" w:w="90"/>
-              <w:bottom w:type="dxa" w:w="50"/>
-              <w:right w:type="dxa" w:w="90"/>
-            </w:tcMar>
-          </w:tcPr>
-          <w:p>
-            <w:pPr>
-              <w:keepNext/>
-              <w:keepLines/>
-              <w:spacing w:after="0"/>
-              <w:jc w:val="left"/>
-            </w:pPr>
-            <w:r>
-              <w:rPr>
-                <w:b w:val="false"/>
-                <w:bCs w:val="false"/>
-                <w:sz w:val="18"/>
-                <w:szCs w:val="18"/>
-              </w:rPr>
-              <w:t xml:space="preserve">Laan law alone</w:t>
-            </w:r>
-          </w:p>
-        </w:tc>
-        <w:tc>
-          <w:tcPr>
-            <w:tcW w:type="dxa" w:w="3500"/>
-            <w:tcBorders>
-              <w:top w:val="none" w:color="FFFFFF" w:sz="0"/>
-              <w:left w:val="none" w:color="FFFFFF" w:sz="0"/>
-              <w:bottom w:val="single" w:color="999999" w:sz="4"/>
-              <w:right w:val="none" w:color="FFFFFF" w:sz="0"/>
-            </w:tcBorders>
-            <w:tcMar>
-              <w:top w:type="dxa" w:w="50"/>
-              <w:left w:type="dxa" w:w="90"/>
-              <w:bottom w:type="dxa" w:w="50"/>
-              <w:right w:type="dxa" w:w="90"/>
-            </w:tcMar>
-          </w:tcPr>
-          <w:p>
-            <w:pPr>
-              <w:keepNext/>
-              <w:keepLines/>
-              <w:spacing w:after="0"/>
-              <w:jc w:val="left"/>
-            </w:pPr>
-            <w:r>
-              <w:rPr>
-                <w:b w:val="false"/>
-                <w:bCs w:val="false"/>
-                <w:sz w:val="18"/>
-                <w:szCs w:val="18"/>
-              </w:rPr>
-              <w:t xml:space="preserve">LOSO RMSE 0.073</w:t>
-            </w:r>
-          </w:p>
-        </w:tc>
-        <w:tc>
-          <w:tcPr>
-            <w:tcW w:type="dxa" w:w="3726"/>
-            <w:tcBorders>
-              <w:top w:val="none" w:color="FFFFFF" w:sz="0"/>
-              <w:left w:val="none" w:color="FFFFFF" w:sz="0"/>
-              <w:bottom w:val="single" w:color="999999" w:sz="4"/>
-              <w:right w:val="none" w:color="FFFFFF" w:sz="0"/>
-            </w:tcBorders>
-            <w:tcMar>
-              <w:top w:type="dxa" w:w="50"/>
-              <w:left w:type="dxa" w:w="90"/>
-              <w:bottom w:type="dxa" w:w="50"/>
-              <w:right w:type="dxa" w:w="90"/>
-            </w:tcMar>
-          </w:tcPr>
-          <w:p>
-            <w:pPr>
-              <w:keepNext/>
-              <w:keepLines/>
-              <w:spacing w:after="0"/>
-              <w:jc w:val="left"/>
-            </w:pPr>
-            <w:r>
-              <w:rPr>
-                <w:b w:val="false"/>
-                <w:bCs w:val="false"/>
-                <w:sz w:val="18"/>
-                <w:szCs w:val="18"/>
-              </w:rPr>
-              <w:t xml:space="preserve">0.250</w:t>
-            </w:r>
-          </w:p>
-        </w:tc>
-      </w:tr>
-      <w:tr>
-        <w:trPr>
-          <w:cantSplit/>
-          <w:tblHeader w:val="false"/>
-        </w:trPr>
-        <w:tc>
-          <w:tcPr>
-            <w:tcW w:type="dxa" w:w="1800"/>
-            <w:tcBorders>
-              <w:top w:val="none" w:color="FFFFFF" w:sz="0"/>
-              <w:left w:val="none" w:color="FFFFFF" w:sz="0"/>
-              <w:bottom w:val="single" w:color="999999" w:sz="4"/>
-              <w:right w:val="none" w:color="FFFFFF" w:sz="0"/>
-            </w:tcBorders>
-            <w:tcMar>
-              <w:top w:type="dxa" w:w="50"/>
-              <w:left w:type="dxa" w:w="90"/>
-              <w:bottom w:type="dxa" w:w="50"/>
-              <w:right w:type="dxa" w:w="90"/>
-            </w:tcMar>
-          </w:tcPr>
-          <w:p>
-            <w:pPr>
-              <w:keepNext/>
-              <w:keepLines/>
-              <w:spacing w:after="0"/>
-              <w:jc w:val="left"/>
-            </w:pPr>
-            <w:r>
-              <w:rPr>
-                <w:b w:val="false"/>
-                <w:bCs w:val="false"/>
-                <w:sz w:val="18"/>
-                <w:szCs w:val="18"/>
-              </w:rPr>
-              <w:t xml:space="preserve">ID RMSE</w:t>
-            </w:r>
-          </w:p>
-        </w:tc>
-        <w:tc>
-          <w:tcPr>
-            <w:tcW w:type="dxa" w:w="3500"/>
-            <w:tcBorders>
-              <w:top w:val="none" w:color="FFFFFF" w:sz="0"/>
-              <w:left w:val="none" w:color="FFFFFF" w:sz="0"/>
-              <w:bottom w:val="single" w:color="999999" w:sz="4"/>
-              <w:right w:val="none" w:color="FFFFFF" w:sz="0"/>
-            </w:tcBorders>
-            <w:tcMar>
-              <w:top w:type="dxa" w:w="50"/>
-              <w:left w:type="dxa" w:w="90"/>
-              <w:bottom w:type="dxa" w:w="50"/>
-              <w:right w:type="dxa" w:w="90"/>
-            </w:tcMar>
-          </w:tcPr>
-          <w:p>
-            <w:pPr>
-              <w:keepNext/>
-              <w:keepLines/>
-              <w:spacing w:after="0"/>
-              <w:jc w:val="left"/>
-            </w:pPr>
-            <w:r>
-              <w:rPr>
-                <w:b w:val="false"/>
-                <w:bCs w:val="false"/>
-                <w:sz w:val="18"/>
-                <w:szCs w:val="18"/>
-              </w:rPr>
-              <w:t xml:space="preserve">GPR 0.0205, XGBoost 0.0187 (XGBoost better)</w:t>
-            </w:r>
-          </w:p>
-        </w:tc>
-        <w:tc>
-          <w:tcPr>
-            <w:tcW w:type="dxa" w:w="3726"/>
-            <w:tcBorders>
-              <w:top w:val="none" w:color="FFFFFF" w:sz="0"/>
-              <w:left w:val="none" w:color="FFFFFF" w:sz="0"/>
-              <w:bottom w:val="single" w:color="999999" w:sz="4"/>
-              <w:right w:val="none" w:color="FFFFFF" w:sz="0"/>
-            </w:tcBorders>
-            <w:tcMar>
-              <w:top w:type="dxa" w:w="50"/>
-              <w:left w:type="dxa" w:w="90"/>
-              <w:bottom w:type="dxa" w:w="50"/>
-              <w:right w:type="dxa" w:w="90"/>
-            </w:tcMar>
-          </w:tcPr>
-          <w:p>
-            <w:pPr>
-              <w:keepNext/>
-              <w:keepLines/>
-              <w:spacing w:after="0"/>
-              <w:jc w:val="left"/>
-            </w:pPr>
-            <w:r>
-              <w:rPr>
-                <w:b w:val="false"/>
-                <w:bCs w:val="false"/>
-                <w:sz w:val="18"/>
-                <w:szCs w:val="18"/>
-              </w:rPr>
-              <w:t xml:space="preserve">GPR 0.0363, XGBoost 0.0462 (GPR better)</w:t>
-            </w:r>
-          </w:p>
-        </w:tc>
-      </w:tr>
-      <w:tr>
-        <w:trPr>
-          <w:cantSplit/>
-          <w:tblHeader w:val="false"/>
-        </w:trPr>
-        <w:tc>
-          <w:tcPr>
-            <w:tcW w:type="dxa" w:w="1800"/>
-            <w:tcBorders>
-              <w:top w:val="none" w:color="FFFFFF" w:sz="0"/>
-              <w:left w:val="none" w:color="FFFFFF" w:sz="0"/>
-              <w:bottom w:val="single" w:color="999999" w:sz="4"/>
-              <w:right w:val="none" w:color="FFFFFF" w:sz="0"/>
-            </w:tcBorders>
-            <w:tcMar>
-              <w:top w:type="dxa" w:w="50"/>
-              <w:left w:type="dxa" w:w="90"/>
-              <w:bottom w:type="dxa" w:w="50"/>
-              <w:right w:type="dxa" w:w="90"/>
-            </w:tcMar>
-          </w:tcPr>
-          <w:p>
-            <w:pPr>
-              <w:keepNext/>
-              <w:keepLines/>
-              <w:spacing w:after="0"/>
-              <w:jc w:val="left"/>
-            </w:pPr>
-            <w:r>
-              <w:rPr>
-                <w:b w:val="false"/>
-                <w:bCs w:val="false"/>
-                <w:sz w:val="18"/>
-                <w:szCs w:val="18"/>
-              </w:rPr>
-              <w:t xml:space="preserve">Other models</w:t>
-            </w:r>
-          </w:p>
-        </w:tc>
-        <w:tc>
-          <w:tcPr>
-            <w:tcW w:type="dxa" w:w="3500"/>
-            <w:tcBorders>
-              <w:top w:val="none" w:color="FFFFFF" w:sz="0"/>
-              <w:left w:val="none" w:color="FFFFFF" w:sz="0"/>
-              <w:bottom w:val="single" w:color="999999" w:sz="4"/>
-              <w:right w:val="none" w:color="FFFFFF" w:sz="0"/>
-            </w:tcBorders>
-            <w:tcMar>
-              <w:top w:type="dxa" w:w="50"/>
-              <w:left w:type="dxa" w:w="90"/>
-              <w:bottom w:type="dxa" w:w="50"/>
-              <w:right w:type="dxa" w:w="90"/>
-            </w:tcMar>
-          </w:tcPr>
-          <w:p>
-            <w:pPr>
-              <w:keepNext/>
-              <w:keepLines/>
-              <w:spacing w:after="0"/>
-              <w:jc w:val="left"/>
-            </w:pPr>
-            <w:r>
-              <w:rPr>
-                <w:b w:val="false"/>
-                <w:bCs w:val="false"/>
-                <w:sz w:val="18"/>
-                <w:szCs w:val="18"/>
-              </w:rPr>
-              <w:t xml:space="preserve">M3–M5 LOSO 0.052–0.054</w:t>
-            </w:r>
-          </w:p>
-        </w:tc>
-        <w:tc>
-          <w:tcPr>
-            <w:tcW w:type="dxa" w:w="3726"/>
-            <w:tcBorders>
-              <w:top w:val="none" w:color="FFFFFF" w:sz="0"/>
-              <w:left w:val="none" w:color="FFFFFF" w:sz="0"/>
-              <w:bottom w:val="single" w:color="999999" w:sz="4"/>
-              <w:right w:val="none" w:color="FFFFFF" w:sz="0"/>
-            </w:tcBorders>
-            <w:tcMar>
-              <w:top w:type="dxa" w:w="50"/>
-              <w:left w:type="dxa" w:w="90"/>
-              <w:bottom w:type="dxa" w:w="50"/>
-              <w:right w:type="dxa" w:w="90"/>
-            </w:tcMar>
-          </w:tcPr>
-          <w:p>
-            <w:pPr>
-              <w:keepNext/>
-              <w:keepLines/>
-              <w:spacing w:after="0"/>
-              <w:jc w:val="left"/>
-            </w:pPr>
-            <w:r>
-              <w:rPr>
-                <w:b w:val="false"/>
-                <w:bCs w:val="false"/>
-                <w:sz w:val="18"/>
-                <w:szCs w:val="18"/>
-              </w:rPr>
-              <w:t xml:space="preserve">Not produced by any run; replaced by Table 3</w:t>
-            </w:r>
-          </w:p>
-        </w:tc>
-      </w:tr>
-      <w:tr>
-        <w:trPr>
-          <w:cantSplit/>
-          <w:tblHeader w:val="false"/>
-        </w:trPr>
-        <w:tc>
-          <w:tcPr>
-            <w:tcW w:type="dxa" w:w="1800"/>
-            <w:tcBorders>
-              <w:top w:val="none" w:color="FFFFFF" w:sz="0"/>
-              <w:left w:val="none" w:color="FFFFFF" w:sz="0"/>
-              <w:bottom w:val="single" w:color="999999" w:sz="4"/>
-              <w:right w:val="none" w:color="FFFFFF" w:sz="0"/>
-            </w:tcBorders>
-            <w:tcMar>
-              <w:top w:type="dxa" w:w="50"/>
-              <w:left w:type="dxa" w:w="90"/>
-              <w:bottom w:type="dxa" w:w="50"/>
-              <w:right w:type="dxa" w:w="90"/>
-            </w:tcMar>
-          </w:tcPr>
-          <w:p>
-            <w:pPr>
-              <w:keepNext/>
-              <w:keepLines/>
-              <w:spacing w:after="0"/>
-              <w:jc w:val="left"/>
-            </w:pPr>
-            <w:r>
-              <w:rPr>
-                <w:b w:val="false"/>
-                <w:bCs w:val="false"/>
-                <w:sz w:val="18"/>
-                <w:szCs w:val="18"/>
-              </w:rPr>
-              <w:t xml:space="preserve">Without descriptors</w:t>
-            </w:r>
-          </w:p>
-        </w:tc>
-        <w:tc>
-          <w:tcPr>
-            <w:tcW w:type="dxa" w:w="3500"/>
-            <w:tcBorders>
-              <w:top w:val="none" w:color="FFFFFF" w:sz="0"/>
-              <w:left w:val="none" w:color="FFFFFF" w:sz="0"/>
-              <w:bottom w:val="single" w:color="999999" w:sz="4"/>
-              <w:right w:val="none" w:color="FFFFFF" w:sz="0"/>
-            </w:tcBorders>
-            <w:tcMar>
-              <w:top w:type="dxa" w:w="50"/>
-              <w:left w:type="dxa" w:w="90"/>
-              <w:bottom w:type="dxa" w:w="50"/>
-              <w:right w:type="dxa" w:w="90"/>
-            </w:tcMar>
-          </w:tcPr>
-          <w:p>
-            <w:pPr>
-              <w:keepNext/>
-              <w:keepLines/>
-              <w:spacing w:after="0"/>
-              <w:jc w:val="left"/>
-            </w:pPr>
-            <w:r>
-              <w:rPr>
-                <w:b w:val="false"/>
-                <w:bCs w:val="false"/>
-                <w:sz w:val="18"/>
-                <w:szCs w:val="18"/>
-              </w:rPr>
-              <w:t xml:space="preserve">"about 0.048"</w:t>
-            </w:r>
-          </w:p>
-        </w:tc>
-        <w:tc>
-          <w:tcPr>
-            <w:tcW w:type="dxa" w:w="3726"/>
-            <w:tcBorders>
-              <w:top w:val="none" w:color="FFFFFF" w:sz="0"/>
-              <w:left w:val="none" w:color="FFFFFF" w:sz="0"/>
-              <w:bottom w:val="single" w:color="999999" w:sz="4"/>
-              <w:right w:val="none" w:color="FFFFFF" w:sz="0"/>
-            </w:tcBorders>
-            <w:tcMar>
-              <w:top w:type="dxa" w:w="50"/>
-              <w:left w:type="dxa" w:w="90"/>
-              <w:bottom w:type="dxa" w:w="50"/>
-              <w:right w:type="dxa" w:w="90"/>
-            </w:tcMar>
-          </w:tcPr>
-          <w:p>
-            <w:pPr>
-              <w:keepNext/>
-              <w:keepLines/>
-              <w:spacing w:after="0"/>
-              <w:jc w:val="left"/>
-            </w:pPr>
-            <w:r>
-              <w:rPr>
-                <w:b w:val="false"/>
-                <w:bCs w:val="false"/>
-                <w:sz w:val="18"/>
-                <w:szCs w:val="18"/>
-              </w:rPr>
-              <w:t xml:space="preserve">Measured 0.0462; interval includes zero</w:t>
-            </w:r>
-          </w:p>
-        </w:tc>
-      </w:tr>
-      <w:tr>
-        <w:trPr>
-          <w:cantSplit/>
-          <w:tblHeader w:val="false"/>
-        </w:trPr>
-        <w:tc>
-          <w:tcPr>
-            <w:tcW w:type="dxa" w:w="1800"/>
-            <w:tcBorders>
-              <w:top w:val="none" w:color="FFFFFF" w:sz="0"/>
-              <w:left w:val="none" w:color="FFFFFF" w:sz="0"/>
-              <w:bottom w:val="single" w:color="999999" w:sz="4"/>
-              <w:right w:val="none" w:color="FFFFFF" w:sz="0"/>
-            </w:tcBorders>
-            <w:tcMar>
-              <w:top w:type="dxa" w:w="50"/>
-              <w:left w:type="dxa" w:w="90"/>
-              <w:bottom w:type="dxa" w:w="50"/>
-              <w:right w:type="dxa" w:w="90"/>
-            </w:tcMar>
-          </w:tcPr>
-          <w:p>
-            <w:pPr>
-              <w:keepNext/>
-              <w:keepLines/>
-              <w:spacing w:after="0"/>
-              <w:jc w:val="left"/>
-            </w:pPr>
-            <w:r>
-              <w:rPr>
-                <w:b w:val="false"/>
-                <w:bCs w:val="false"/>
-                <w:sz w:val="18"/>
-                <w:szCs w:val="18"/>
-              </w:rPr>
-              <w:t xml:space="preserve">Within ±0.05</w:t>
-            </w:r>
-          </w:p>
-        </w:tc>
-        <w:tc>
-          <w:tcPr>
-            <w:tcW w:type="dxa" w:w="3500"/>
-            <w:tcBorders>
-              <w:top w:val="none" w:color="FFFFFF" w:sz="0"/>
-              <w:left w:val="none" w:color="FFFFFF" w:sz="0"/>
-              <w:bottom w:val="single" w:color="999999" w:sz="4"/>
-              <w:right w:val="none" w:color="FFFFFF" w:sz="0"/>
-            </w:tcBorders>
-            <w:tcMar>
-              <w:top w:type="dxa" w:w="50"/>
-              <w:left w:type="dxa" w:w="90"/>
-              <w:bottom w:type="dxa" w:w="50"/>
-              <w:right w:type="dxa" w:w="90"/>
-            </w:tcMar>
-          </w:tcPr>
-          <w:p>
-            <w:pPr>
-              <w:keepNext/>
-              <w:keepLines/>
-              <w:spacing w:after="0"/>
-              <w:jc w:val="left"/>
-            </w:pPr>
-            <w:r>
-              <w:rPr>
-                <w:b w:val="false"/>
-                <w:bCs w:val="false"/>
-                <w:sz w:val="18"/>
-                <w:szCs w:val="18"/>
-              </w:rPr>
-              <w:t xml:space="preserve">GPR 97%, XGBoost 89%</w:t>
-            </w:r>
-          </w:p>
-        </w:tc>
-        <w:tc>
-          <w:tcPr>
-            <w:tcW w:type="dxa" w:w="3726"/>
-            <w:tcBorders>
-              <w:top w:val="none" w:color="FFFFFF" w:sz="0"/>
-              <w:left w:val="none" w:color="FFFFFF" w:sz="0"/>
-              <w:bottom w:val="single" w:color="999999" w:sz="4"/>
-              <w:right w:val="none" w:color="FFFFFF" w:sz="0"/>
-            </w:tcBorders>
-            <w:tcMar>
-              <w:top w:type="dxa" w:w="50"/>
-              <w:left w:type="dxa" w:w="90"/>
-              <w:bottom w:type="dxa" w:w="50"/>
-              <w:right w:type="dxa" w:w="90"/>
-            </w:tcMar>
-          </w:tcPr>
-          <w:p>
-            <w:pPr>
-              <w:keepNext/>
-              <w:keepLines/>
-              <w:spacing w:after="0"/>
-              <w:jc w:val="left"/>
-            </w:pPr>
-            <w:r>
-              <w:rPr>
-                <w:b w:val="false"/>
-                <w:bCs w:val="false"/>
-                <w:sz w:val="18"/>
-                <w:szCs w:val="18"/>
-              </w:rPr>
-              <w:t xml:space="preserve">GPR 87%, XGBoost 81%</w:t>
-            </w:r>
-          </w:p>
-        </w:tc>
-      </w:tr>
-      <w:tr>
-        <w:trPr>
-          <w:cantSplit/>
-          <w:tblHeader w:val="false"/>
-        </w:trPr>
-        <w:tc>
-          <w:tcPr>
-            <w:tcW w:type="dxa" w:w="1800"/>
-            <w:tcBorders>
-              <w:top w:val="none" w:color="FFFFFF" w:sz="0"/>
-              <w:left w:val="none" w:color="FFFFFF" w:sz="0"/>
-              <w:bottom w:val="single" w:color="999999" w:sz="4"/>
-              <w:right w:val="none" w:color="FFFFFF" w:sz="0"/>
-            </w:tcBorders>
-            <w:tcMar>
-              <w:top w:type="dxa" w:w="50"/>
-              <w:left w:type="dxa" w:w="90"/>
-              <w:bottom w:type="dxa" w:w="50"/>
-              <w:right w:type="dxa" w:w="90"/>
-            </w:tcMar>
-          </w:tcPr>
-          <w:p>
-            <w:pPr>
-              <w:keepNext/>
-              <w:keepLines/>
-              <w:spacing w:after="0"/>
-              <w:jc w:val="left"/>
-            </w:pPr>
-            <w:r>
-              <w:rPr>
-                <w:b w:val="false"/>
-                <w:bCs w:val="false"/>
-                <w:sz w:val="18"/>
-                <w:szCs w:val="18"/>
-              </w:rPr>
-              <w:t xml:space="preserve">Physics backbone CI</w:t>
-            </w:r>
-          </w:p>
-        </w:tc>
-        <w:tc>
-          <w:tcPr>
-            <w:tcW w:type="dxa" w:w="3500"/>
-            <w:tcBorders>
-              <w:top w:val="none" w:color="FFFFFF" w:sz="0"/>
-              <w:left w:val="none" w:color="FFFFFF" w:sz="0"/>
-              <w:bottom w:val="single" w:color="999999" w:sz="4"/>
-              <w:right w:val="none" w:color="FFFFFF" w:sz="0"/>
-            </w:tcBorders>
-            <w:tcMar>
-              <w:top w:type="dxa" w:w="50"/>
-              <w:left w:type="dxa" w:w="90"/>
-              <w:bottom w:type="dxa" w:w="50"/>
-              <w:right w:type="dxa" w:w="90"/>
-            </w:tcMar>
-          </w:tcPr>
-          <w:p>
-            <w:pPr>
-              <w:keepNext/>
-              <w:keepLines/>
-              <w:spacing w:after="0"/>
-              <w:jc w:val="left"/>
-            </w:pPr>
-            <w:r>
-              <w:rPr>
-                <w:b w:val="false"/>
-                <w:bCs w:val="false"/>
-                <w:sz w:val="18"/>
-                <w:szCs w:val="18"/>
-              </w:rPr>
-              <w:t xml:space="preserve">[−0.0022, +0.0001]</w:t>
-            </w:r>
-          </w:p>
-        </w:tc>
-        <w:tc>
-          <w:tcPr>
-            <w:tcW w:type="dxa" w:w="3726"/>
-            <w:tcBorders>
-              <w:top w:val="none" w:color="FFFFFF" w:sz="0"/>
-              <w:left w:val="none" w:color="FFFFFF" w:sz="0"/>
-              <w:bottom w:val="single" w:color="999999" w:sz="4"/>
-              <w:right w:val="none" w:color="FFFFFF" w:sz="0"/>
-            </w:tcBorders>
-            <w:tcMar>
-              <w:top w:type="dxa" w:w="50"/>
-              <w:left w:type="dxa" w:w="90"/>
-              <w:bottom w:type="dxa" w:w="50"/>
-              <w:right w:type="dxa" w:w="90"/>
-            </w:tcMar>
-          </w:tcPr>
-          <w:p>
-            <w:pPr>
-              <w:keepNext/>
-              <w:keepLines/>
-              <w:spacing w:after="0"/>
-              <w:jc w:val="left"/>
-            </w:pPr>
-            <w:r>
-              <w:rPr>
-                <w:b w:val="false"/>
-                <w:bCs w:val="false"/>
-                <w:sz w:val="18"/>
-                <w:szCs w:val="18"/>
-              </w:rPr>
-              <w:t xml:space="preserve">[-0.0030, +0.0001]</w:t>
-            </w:r>
-          </w:p>
-        </w:tc>
-      </w:tr>
-      <w:tr>
-        <w:trPr>
-          <w:cantSplit/>
-          <w:tblHeader w:val="false"/>
-        </w:trPr>
-        <w:tc>
-          <w:tcPr>
-            <w:tcW w:type="dxa" w:w="1800"/>
-            <w:tcBorders>
-              <w:top w:val="none" w:color="FFFFFF" w:sz="0"/>
-              <w:left w:val="none" w:color="FFFFFF" w:sz="0"/>
-              <w:bottom w:val="single" w:color="999999" w:sz="4"/>
-              <w:right w:val="none" w:color="FFFFFF" w:sz="0"/>
-            </w:tcBorders>
-            <w:tcMar>
-              <w:top w:type="dxa" w:w="50"/>
-              <w:left w:type="dxa" w:w="90"/>
-              <w:bottom w:type="dxa" w:w="50"/>
-              <w:right w:type="dxa" w:w="90"/>
-            </w:tcMar>
-          </w:tcPr>
-          <w:p>
-            <w:pPr>
-              <w:keepNext/>
-              <w:keepLines/>
-              <w:spacing w:after="0"/>
-              <w:jc w:val="left"/>
-            </w:pPr>
-            <w:r>
-              <w:rPr>
-                <w:b w:val="false"/>
-                <w:bCs w:val="false"/>
-                <w:sz w:val="18"/>
-                <w:szCs w:val="18"/>
-              </w:rPr>
-              <w:t xml:space="preserve">Interval details</w:t>
-            </w:r>
-          </w:p>
-        </w:tc>
-        <w:tc>
-          <w:tcPr>
-            <w:tcW w:type="dxa" w:w="3500"/>
-            <w:tcBorders>
-              <w:top w:val="none" w:color="FFFFFF" w:sz="0"/>
-              <w:left w:val="none" w:color="FFFFFF" w:sz="0"/>
-              <w:bottom w:val="single" w:color="999999" w:sz="4"/>
-              <w:right w:val="none" w:color="FFFFFF" w:sz="0"/>
-            </w:tcBorders>
-            <w:tcMar>
-              <w:top w:type="dxa" w:w="50"/>
-              <w:left w:type="dxa" w:w="90"/>
-              <w:bottom w:type="dxa" w:w="50"/>
-              <w:right w:type="dxa" w:w="90"/>
-            </w:tcMar>
-          </w:tcPr>
-          <w:p>
-            <w:pPr>
-              <w:keepNext/>
-              <w:keepLines/>
-              <w:spacing w:after="0"/>
-              <w:jc w:val="left"/>
-            </w:pPr>
-            <w:r>
-              <w:rPr>
-                <w:b w:val="false"/>
-                <w:bCs w:val="false"/>
-                <w:sz w:val="18"/>
-                <w:szCs w:val="18"/>
-              </w:rPr>
-              <w:t xml:space="preserve">Per-surface q values; "D1200 83%"</w:t>
-            </w:r>
-          </w:p>
-        </w:tc>
-        <w:tc>
-          <w:tcPr>
-            <w:tcW w:type="dxa" w:w="3726"/>
-            <w:tcBorders>
-              <w:top w:val="none" w:color="FFFFFF" w:sz="0"/>
-              <w:left w:val="none" w:color="FFFFFF" w:sz="0"/>
-              <w:bottom w:val="single" w:color="999999" w:sz="4"/>
-              <w:right w:val="none" w:color="FFFFFF" w:sz="0"/>
-            </w:tcBorders>
-            <w:tcMar>
-              <w:top w:type="dxa" w:w="50"/>
-              <w:left w:type="dxa" w:w="90"/>
-              <w:bottom w:type="dxa" w:w="50"/>
-              <w:right w:type="dxa" w:w="90"/>
-            </w:tcMar>
-          </w:tcPr>
-          <w:p>
-            <w:pPr>
-              <w:keepNext/>
-              <w:keepLines/>
-              <w:spacing w:after="0"/>
-              <w:jc w:val="left"/>
-            </w:pPr>
-            <w:r>
-              <w:rPr>
-                <w:b w:val="false"/>
-                <w:bCs w:val="false"/>
-                <w:sz w:val="18"/>
-                <w:szCs w:val="18"/>
-              </w:rPr>
-              <w:t xml:space="preserve">Per-surface coverage 84%–96%; not reported per surface q</w:t>
-            </w:r>
-          </w:p>
-        </w:tc>
-      </w:tr>
-      <w:tr>
-        <w:trPr>
-          <w:cantSplit/>
-          <w:tblHeader w:val="false"/>
-        </w:trPr>
-        <w:tc>
-          <w:tcPr>
-            <w:tcW w:type="dxa" w:w="1800"/>
-            <w:tcBorders>
-              <w:top w:val="none" w:color="FFFFFF" w:sz="0"/>
-              <w:left w:val="none" w:color="FFFFFF" w:sz="0"/>
-              <w:bottom w:val="single" w:color="999999" w:sz="4"/>
-              <w:right w:val="none" w:color="FFFFFF" w:sz="0"/>
-            </w:tcBorders>
-            <w:tcMar>
-              <w:top w:type="dxa" w:w="50"/>
-              <w:left w:type="dxa" w:w="90"/>
-              <w:bottom w:type="dxa" w:w="50"/>
-              <w:right w:type="dxa" w:w="90"/>
-            </w:tcMar>
-          </w:tcPr>
-          <w:p>
-            <w:pPr>
-              <w:keepNext/>
-              <w:keepLines/>
-              <w:spacing w:after="0"/>
-              <w:jc w:val="left"/>
-            </w:pPr>
-            <w:r>
-              <w:rPr>
-                <w:b w:val="false"/>
-                <w:bCs w:val="false"/>
-                <w:sz w:val="18"/>
-                <w:szCs w:val="18"/>
-              </w:rPr>
-              <w:t xml:space="preserve">Unsupported claims</w:t>
-            </w:r>
-          </w:p>
-        </w:tc>
-        <w:tc>
-          <w:tcPr>
-            <w:tcW w:type="dxa" w:w="3500"/>
-            <w:tcBorders>
-              <w:top w:val="none" w:color="FFFFFF" w:sz="0"/>
-              <w:left w:val="none" w:color="FFFFFF" w:sz="0"/>
-              <w:bottom w:val="single" w:color="999999" w:sz="4"/>
-              <w:right w:val="none" w:color="FFFFFF" w:sz="0"/>
-            </w:tcBorders>
-            <w:tcMar>
-              <w:top w:type="dxa" w:w="50"/>
-              <w:left w:type="dxa" w:w="90"/>
-              <w:bottom w:type="dxa" w:w="50"/>
-              <w:right w:type="dxa" w:w="90"/>
-            </w:tcMar>
-          </w:tcPr>
-          <w:p>
-            <w:pPr>
-              <w:keepNext/>
-              <w:keepLines/>
-              <w:spacing w:after="0"/>
-              <w:jc w:val="left"/>
-            </w:pPr>
-            <w:r>
-              <w:rPr>
-                <w:b w:val="false"/>
-                <w:bCs w:val="false"/>
-                <w:sz w:val="18"/>
-                <w:szCs w:val="18"/>
-              </w:rPr>
-              <w:t xml:space="preserve">"99.6% accuracy" (PITCH.md); "~$50 USD per droplet impact" (draft)</w:t>
-            </w:r>
-          </w:p>
-        </w:tc>
-        <w:tc>
-          <w:tcPr>
-            <w:tcW w:type="dxa" w:w="3726"/>
-            <w:tcBorders>
-              <w:top w:val="none" w:color="FFFFFF" w:sz="0"/>
-              <w:left w:val="none" w:color="FFFFFF" w:sz="0"/>
-              <w:bottom w:val="single" w:color="999999" w:sz="4"/>
-              <w:right w:val="none" w:color="FFFFFF" w:sz="0"/>
-            </w:tcBorders>
-            <w:tcMar>
-              <w:top w:type="dxa" w:w="50"/>
-              <w:left w:type="dxa" w:w="90"/>
-              <w:bottom w:type="dxa" w:w="50"/>
-              <w:right w:type="dxa" w:w="90"/>
-            </w:tcMar>
-          </w:tcPr>
-          <w:p>
-            <w:pPr>
-              <w:keepNext/>
-              <w:keepLines/>
-              <w:spacing w:after="0"/>
-              <w:jc w:val="left"/>
-            </w:pPr>
-            <w:r>
-              <w:rPr>
-                <w:b w:val="false"/>
-                <w:bCs w:val="false"/>
-                <w:sz w:val="18"/>
-                <w:szCs w:val="18"/>
-              </w:rPr>
-              <w:t xml:space="preserve">No source; removed</w:t>
-            </w:r>
-          </w:p>
-        </w:tc>
-      </w:tr>
-      <w:tr>
-        <w:trPr>
-          <w:cantSplit/>
-          <w:tblHeader w:val="false"/>
-        </w:trPr>
-        <w:tc>
-          <w:tcPr>
-            <w:tcW w:type="dxa" w:w="1800"/>
-            <w:tcBorders>
-              <w:top w:val="none" w:color="FFFFFF" w:sz="0"/>
-              <w:left w:val="none" w:color="FFFFFF" w:sz="0"/>
-              <w:bottom w:val="single" w:color="999999" w:sz="4"/>
-              <w:right w:val="none" w:color="FFFFFF" w:sz="0"/>
-            </w:tcBorders>
-            <w:tcMar>
-              <w:top w:type="dxa" w:w="50"/>
-              <w:left w:type="dxa" w:w="90"/>
-              <w:bottom w:type="dxa" w:w="50"/>
-              <w:right w:type="dxa" w:w="90"/>
-            </w:tcMar>
-          </w:tcPr>
-          <w:p>
-            <w:pPr>
-              <w:keepNext w:val="false"/>
-              <w:keepLines/>
-              <w:spacing w:after="0"/>
-              <w:jc w:val="left"/>
-            </w:pPr>
-            <w:r>
-              <w:rPr>
-                <w:b w:val="false"/>
-                <w:bCs w:val="false"/>
-                <w:sz w:val="18"/>
-                <w:szCs w:val="18"/>
-              </w:rPr>
-              <w:t xml:space="preserve">Authorship</w:t>
-            </w:r>
-          </w:p>
-        </w:tc>
-        <w:tc>
-          <w:tcPr>
-            <w:tcW w:type="dxa" w:w="3500"/>
-            <w:tcBorders>
-              <w:top w:val="none" w:color="FFFFFF" w:sz="0"/>
-              <w:left w:val="none" w:color="FFFFFF" w:sz="0"/>
-              <w:bottom w:val="single" w:color="999999" w:sz="4"/>
-              <w:right w:val="none" w:color="FFFFFF" w:sz="0"/>
-            </w:tcBorders>
-            <w:tcMar>
-              <w:top w:type="dxa" w:w="50"/>
-              <w:left w:type="dxa" w:w="90"/>
-              <w:bottom w:type="dxa" w:w="50"/>
-              <w:right w:type="dxa" w:w="90"/>
-            </w:tcMar>
-          </w:tcPr>
-          <w:p>
-            <w:pPr>
-              <w:keepNext w:val="false"/>
-              <w:keepLines/>
-              <w:spacing w:after="0"/>
-              <w:jc w:val="left"/>
-            </w:pPr>
-            <w:r>
-              <w:rPr>
-                <w:b w:val="false"/>
-                <w:bCs w:val="false"/>
-                <w:sz w:val="18"/>
-                <w:szCs w:val="18"/>
-              </w:rPr>
-              <w:t xml:space="preserve">Claude listed as author</w:t>
-            </w:r>
-          </w:p>
-        </w:tc>
-        <w:tc>
-          <w:tcPr>
-            <w:tcW w:type="dxa" w:w="3726"/>
-            <w:tcBorders>
-              <w:top w:val="none" w:color="FFFFFF" w:sz="0"/>
-              <w:left w:val="none" w:color="FFFFFF" w:sz="0"/>
-              <w:bottom w:val="single" w:color="999999" w:sz="4"/>
-              <w:right w:val="none" w:color="FFFFFF" w:sz="0"/>
-            </w:tcBorders>
-            <w:tcMar>
-              <w:top w:type="dxa" w:w="50"/>
-              <w:left w:type="dxa" w:w="90"/>
-              <w:bottom w:type="dxa" w:w="50"/>
-              <w:right w:type="dxa" w:w="90"/>
-            </w:tcMar>
-          </w:tcPr>
-          <w:p>
-            <w:pPr>
-              <w:keepNext w:val="false"/>
-              <w:keepLines/>
-              <w:spacing w:after="0"/>
-              <w:jc w:val="left"/>
-            </w:pPr>
-            <w:r>
-              <w:rPr>
-                <w:b w:val="false"/>
-                <w:bCs w:val="false"/>
-                <w:sz w:val="18"/>
-                <w:szCs w:val="18"/>
-              </w:rPr>
-              <w:t xml:space="preserve">AI assistance disclosed in Acknowledgements</w:t>
-            </w:r>
-          </w:p>
-        </w:tc>
-      </w:tr>
-    </w:tbl>
-    <w:p>
-      <w:pPr>
-        <w:pStyle w:val="Heading1"/>
-        <w:keepNext/>
-        <w:spacing w:after="120" w:before="280"/>
-      </w:pPr>
-      <w:r>
-        <w:t xml:space="preserve">Appendix B. Project log (summary of the working sessions)</w:t>
-      </w:r>
-    </w:p>
-    <w:p>
-      <w:pPr>
-        <w:spacing w:after="120" w:before="0" w:line="276"/>
-        <w:jc w:val="both"/>
-      </w:pPr>
-      <w:r>
-        <w:t xml:space="preserve">This is a factual summary of the work done with the AI assistant between 23 and 24 September 2026.</w:t>
-      </w:r>
-    </w:p>
-    <w:p>
-      <w:pPr>
-        <w:pStyle w:val="ListParagraph"/>
-        <w:numPr>
-          <w:ilvl w:val="0"/>
-          <w:numId w:val="3"/>
-        </w:numPr>
-        <w:spacing w:after="60" w:line="276"/>
-        <w:jc w:val="left"/>
-      </w:pPr>
-      <w:r>
-        <w:rPr>
-          <w:b/>
-          <w:bCs/>
-        </w:rPr>
-        <w:t xml:space="preserve">23 Sept — analysis pipeline.</w:t>
-      </w:r>
-      <w:r>
-        <w:t xml:space="preserve"> The pipeline for Phases 3–7 was automated on the earlier project: physics-residual models, paired bootstrap comparisons, split-conformal intervals, OOD scoring and SHAP. An audit found that the bootstrap resampled replicate conditions rather than surfaces; after the fix the Laan backbone was no longer significant, and the plain GP was kept. Conformal coverage was made honest by calibrating each surface on the other 11.</w:t>
-      </w:r>
-    </w:p>
-    <w:p>
-      <w:pPr>
-        <w:pStyle w:val="ListParagraph"/>
-        <w:numPr>
-          <w:ilvl w:val="0"/>
-          <w:numId w:val="3"/>
-        </w:numPr>
-        <w:spacing w:after="60" w:line="276"/>
-        <w:jc w:val="left"/>
-      </w:pPr>
-      <w:r>
-        <w:rPr>
-          <w:b/>
-          <w:bCs/>
-        </w:rPr>
-        <w:t xml:space="preserve">23 Sept — comparison and tools.</w:t>
-      </w:r>
-      <w:r>
-        <w:t xml:space="preserve"> XGBoost was refitted on the exact GP inputs and a three-panel comparison figure was produced (LOSO 0.0400 against 0.0563; GP better on 9 of 12 surfaces). A Streamlit dashboard, a FastAPI service and a browser predictor were built; the browser matched Python to 10</w:t>
-      </w:r>
-      <w:r>
-        <w:rPr>
-          <w:vertAlign w:val="superscript"/>
-        </w:rPr>
-        <w:t xml:space="preserve">−12</w:t>
-      </w:r>
-      <w:r>
-        <w:t xml:space="preserve">. Four poster panels and the pitch scripts were updated.</w:t>
-      </w:r>
-    </w:p>
-    <w:p>
-      <w:pPr>
-        <w:pStyle w:val="ListParagraph"/>
-        <w:numPr>
-          <w:ilvl w:val="0"/>
-          <w:numId w:val="3"/>
-        </w:numPr>
-        <w:spacing w:after="60" w:line="276"/>
-        <w:jc w:val="left"/>
-      </w:pPr>
-      <w:r>
-        <w:rPr>
-          <w:b/>
-          <w:bCs/>
-        </w:rPr>
-        <w:t xml:space="preserve">23 Sept — packaging and first draft.</w:t>
-      </w:r>
-      <w:r>
-        <w:t xml:space="preserve"> All code and results were packaged. The single 53 MB archive exceeded the 30 MB upload limit, so it was sent as four parts. A research-paper draft was then written after the conversation context had been summarised; it contained the errors listed in Appendix A.</w:t>
-      </w:r>
-    </w:p>
-    <w:p>
-      <w:pPr>
-        <w:pStyle w:val="ListParagraph"/>
-        <w:numPr>
-          <w:ilvl w:val="0"/>
-          <w:numId w:val="3"/>
-        </w:numPr>
-        <w:spacing w:after="60" w:line="276"/>
-        <w:jc w:val="left"/>
-      </w:pPr>
-      <w:r>
-        <w:rPr>
-          <w:b/>
-          <w:bCs/>
-        </w:rPr>
-        <w:t xml:space="preserve">23 Sept — Astra question.</w:t>
-      </w:r>
-      <w:r>
-        <w:t xml:space="preserve"> You asked about "Astra". My answers covered DataStax Astra DB with Claude and with GPT; you then clarified that you meant a ChatGPT model called Astra, which I did not identify. That question is unresolved. Those answers also contained inaccuracies: Claude's weights are not publicly available, and Anthropic does not offer an embeddings API.</w:t>
-      </w:r>
-    </w:p>
-    <w:p>
-      <w:pPr>
-        <w:pStyle w:val="ListParagraph"/>
-        <w:numPr>
-          <w:ilvl w:val="0"/>
-          <w:numId w:val="3"/>
-        </w:numPr>
-        <w:spacing w:after="60" w:line="276"/>
-        <w:jc w:val="left"/>
-      </w:pPr>
-      <w:r>
-        <w:rPr>
-          <w:b/>
-          <w:bCs/>
-        </w:rPr>
-        <w:t xml:space="preserve">23 Sept, 23:00.</w:t>
-      </w:r>
-      <w:r>
-        <w:t xml:space="preserve"> You sent Droplet Intelligence v2.1. It was installed from requirements-sem.txt and served on port 8000. Health, prediction for all five models, custom surfaces, input validation (HTTP 415/422) and extrapolation flags all worked. All 18 tests passed, the JavaScript–Python parity check passed, and the SEM command-line tool worked on the original TIFFs (the bundled JPEG thumbnails are rejected by design). The REF-H error in the paper draft was flagged.</w:t>
-      </w:r>
-    </w:p>
-    <w:p>
-      <w:pPr>
-        <w:pStyle w:val="ListParagraph"/>
-        <w:numPr>
-          <w:ilvl w:val="0"/>
-          <w:numId w:val="3"/>
-        </w:numPr>
-        <w:spacing w:after="60" w:line="276"/>
-        <w:jc w:val="left"/>
-      </w:pPr>
-      <w:r>
-        <w:rPr>
-          <w:b/>
-          <w:bCs/>
-        </w:rPr>
-        <w:t xml:space="preserve">24 Sept.</w:t>
-      </w:r>
-      <w:r>
-        <w:t xml:space="preserve"> This paper was rebuilt from the v2.1 result files. Two missing analyses were run (Laan law alone; GP without descriptors), four figures were generated from saved predictions, the dataset was traced to its published source, and every number was checked against the result files.</w:t>
-      </w:r>
-    </w:p>
     <w:sectPr>
-      <w:footerReference w:type="default" r:id="rId7"/>
+      <w:footerReference w:type="default" r:id="rId6"/>
       <w:pgSz w:w="11906" w:h="16838" w:orient="portrait"/>
       <w:pgMar w:top="1300" w:right="1440" w:bottom="1300" w:left="1440" w:header="708" w:footer="708" w:gutter="0"/>
       <w:pgNumType/>
@@ -12935,10 +10904,6 @@
     </w:sectPr>
   </w:body>
 </w:document>
-</file>
-
-<file path=word/comments.xml><?xml version="1.0" encoding="utf-8"?>
-<w:comments xmlns:cx="http://schemas.microsoft.com/office/drawing/2014/chartex" xmlns:cx1="http://schemas.microsoft.com/office/drawing/2015/9/8/chartex" xmlns:cx2="http://schemas.microsoft.com/office/drawing/2015/10/21/chartex" xmlns:cx3="http://schemas.microsoft.com/office/drawing/2016/5/9/chartex" xmlns:cx4="http://schemas.microsoft.com/office/drawing/2016/5/10/chartex" xmlns:cx5="http://schemas.microsoft.com/office/drawing/2016/5/11/chartex" xmlns:cx6="http://schemas.microsoft.com/office/drawing/2016/5/12/chartex" xmlns:cx7="http://schemas.microsoft.com/office/drawing/2016/5/13/chartex" xmlns:cx8="http://schemas.microsoft.com/office/drawing/2016/5/14/chartex" xmlns:mc="http://schemas.openxmlformats.org/markup-compatibility/2006" xmlns:aink="http://schemas.microsoft.com/office/drawing/2016/ink" xmlns:am3d="http://schemas.microsoft.com/office/drawing/2017/model3d" xmlns:o="urn:schemas-microsoft-com:office:office" xmlns:r="http://schemas.openxmlformats.org/officeDocument/2006/relationships" xmlns:m="http://schemas.openxmlformats.org/officeDocument/2006/math" xmlns:v="urn:schemas-microsoft-com:vml" xmlns:wp14="http://schemas.microsoft.com/office/word/2010/wordprocessingDrawing" xmlns:wp="http://schemas.openxmlformats.org/drawingml/2006/wordprocessingDrawing" xmlns:w10="urn:schemas-microsoft-com:office:word" xmlns:w="http://schemas.openxmlformats.org/wordprocessingml/2006/main" xmlns:w14="http://schemas.microsoft.com/office/word/2010/wordml" xmlns:w15="http://schemas.microsoft.com/office/word/2012/wordml" xmlns:w16cex="http://schemas.microsoft.com/office/word/2018/wordml/cex" xmlns:w16cid="http://schemas.microsoft.com/office/word/2016/wordml/cid" xmlns:w16="http://schemas.microsoft.com/office/word/2018/wordml" xmlns:w16sdtdh="http://schemas.microsoft.com/office/word/2020/wordml/sdtdatahash" xmlns:w16se="http://schemas.microsoft.com/office/word/2015/wordml/symex" xmlns:wpg="http://schemas.microsoft.com/office/word/2010/wordprocessingGroup" xmlns:wpi="http://schemas.microsoft.com/office/word/2010/wordprocessingInk" xmlns:wne="http://schemas.microsoft.com/office/word/2006/wordml" xmlns:wps="http://schemas.microsoft.com/office/word/2010/wordprocessingShape"/>
 </file>
 
 <file path=word/endnotes.xml><?xml version="1.0" encoding="utf-8"?>
@@ -13040,7 +11005,7 @@
 <w:numbering xmlns:wpc="http://schemas.microsoft.com/office/word/2010/wordprocessingCanvas" xmlns:mc="http://schemas.openxmlformats.org/markup-compatibility/2006" xmlns:o="urn:schemas-microsoft-com:office:office" xmlns:r="http://schemas.openxmlformats.org/officeDocument/2006/relationships" xmlns:m="http://schemas.openxmlformats.org/officeDocument/2006/math" xmlns:v="urn:schemas-microsoft-com:vml" xmlns:wp14="http://schemas.microsoft.com/office/word/2010/wordprocessingDrawing" xmlns:wp="http://schemas.openxmlformats.org/drawingml/2006/wordprocessingDrawing" xmlns:w10="urn:schemas-microsoft-com:office:word" xmlns:w="http://schemas.openxmlformats.org/wordprocessingml/2006/main" xmlns:w14="http://schemas.microsoft.com/office/word/2010/wordml" xmlns:w15="http://schemas.microsoft.com/office/word/2012/wordml" xmlns:wpg="http://schemas.microsoft.com/office/word/2010/wordprocessingGroup" xmlns:wpi="http://schemas.microsoft.com/office/word/2010/wordprocessingInk" xmlns:wne="http://schemas.microsoft.com/office/word/2006/wordml" xmlns:wps="http://schemas.microsoft.com/office/word/2010/wordprocessingShape" mc:Ignorable="w14 w15 wp14">
   <w:abstractNum w:abstractNumId="1" w15:restartNumberingAfterBreak="0">
     <w:multiLevelType w:val="hybridMultilevel"/>
-    <w:lvl w:ilvl="0" w15:tentative="1">
+    <w:lvl w:ilvl="0" w:tentative="1">
       <w:start w:val="1"/>
       <w:numFmt w:val="bullet"/>
       <w:lvlText w:val="●"/>
@@ -13049,7 +11014,7 @@
         <w:ind w:left="720" w:hanging="360"/>
       </w:pPr>
     </w:lvl>
-    <w:lvl w:ilvl="1" w15:tentative="1">
+    <w:lvl w:ilvl="1" w:tentative="1">
       <w:start w:val="1"/>
       <w:numFmt w:val="bullet"/>
       <w:lvlText w:val="○"/>
@@ -13058,7 +11023,7 @@
         <w:ind w:left="1440" w:hanging="360"/>
       </w:pPr>
     </w:lvl>
-    <w:lvl w:ilvl="2" w15:tentative="1">
+    <w:lvl w:ilvl="2" w:tentative="1">
       <w:start w:val="1"/>
       <w:numFmt w:val="bullet"/>
       <w:lvlText w:val="■"/>
@@ -13067,7 +11032,7 @@
         <w:ind w:left="2160" w:hanging="360"/>
       </w:pPr>
     </w:lvl>
-    <w:lvl w:ilvl="3" w15:tentative="1">
+    <w:lvl w:ilvl="3" w:tentative="1">
       <w:start w:val="1"/>
       <w:numFmt w:val="bullet"/>
       <w:lvlText w:val="●"/>
@@ -13076,7 +11041,7 @@
         <w:ind w:left="2880" w:hanging="360"/>
       </w:pPr>
     </w:lvl>
-    <w:lvl w:ilvl="4" w15:tentative="1">
+    <w:lvl w:ilvl="4" w:tentative="1">
       <w:start w:val="1"/>
       <w:numFmt w:val="bullet"/>
       <w:lvlText w:val="○"/>
@@ -13085,7 +11050,7 @@
         <w:ind w:left="3600" w:hanging="360"/>
       </w:pPr>
     </w:lvl>
-    <w:lvl w:ilvl="5" w15:tentative="1">
+    <w:lvl w:ilvl="5" w:tentative="1">
       <w:start w:val="1"/>
       <w:numFmt w:val="bullet"/>
       <w:lvlText w:val="■"/>
@@ -13094,7 +11059,7 @@
         <w:ind w:left="4320" w:hanging="360"/>
       </w:pPr>
     </w:lvl>
-    <w:lvl w:ilvl="6" w15:tentative="1">
+    <w:lvl w:ilvl="6" w:tentative="1">
       <w:start w:val="1"/>
       <w:numFmt w:val="bullet"/>
       <w:lvlText w:val="●"/>
@@ -13103,7 +11068,7 @@
         <w:ind w:left="5040" w:hanging="360"/>
       </w:pPr>
     </w:lvl>
-    <w:lvl w:ilvl="7" w15:tentative="1">
+    <w:lvl w:ilvl="7" w:tentative="1">
       <w:start w:val="1"/>
       <w:numFmt w:val="bullet"/>
       <w:lvlText w:val="●"/>
@@ -13112,7 +11077,7 @@
         <w:ind w:left="5760" w:hanging="360"/>
       </w:pPr>
     </w:lvl>
-    <w:lvl w:ilvl="8" w15:tentative="1">
+    <w:lvl w:ilvl="8" w:tentative="1">
       <w:start w:val="1"/>
       <w:numFmt w:val="bullet"/>
       <w:lvlText w:val="●"/>
@@ -13124,7 +11089,7 @@
   </w:abstractNum>
   <w:abstractNum w:abstractNumId="2" w15:restartNumberingAfterBreak="0">
     <w:multiLevelType w:val="hybridMultilevel"/>
-    <w:lvl w:ilvl="0" w15:tentative="1">
+    <w:lvl w:ilvl="0" w:tentative="1">
       <w:start w:val="1"/>
       <w:numFmt w:val="bullet"/>
       <w:lvlText w:val="•"/>
@@ -13136,7 +11101,7 @@
   </w:abstractNum>
   <w:abstractNum w:abstractNumId="3" w15:restartNumberingAfterBreak="0">
     <w:multiLevelType w:val="hybridMultilevel"/>
-    <w:lvl w:ilvl="0" w15:tentative="1">
+    <w:lvl w:ilvl="0" w:tentative="1">
       <w:start w:val="1"/>
       <w:numFmt w:val="decimal"/>
       <w:lvlText w:val="(%1)"/>
@@ -13148,7 +11113,7 @@
   </w:abstractNum>
   <w:abstractNum w:abstractNumId="4" w15:restartNumberingAfterBreak="0">
     <w:multiLevelType w:val="hybridMultilevel"/>
-    <w:lvl w:ilvl="0" w15:tentative="1">
+    <w:lvl w:ilvl="0" w:tentative="1">
       <w:start w:val="1"/>
       <w:numFmt w:val="decimal"/>
       <w:lvlText w:val="[%1]"/>
@@ -13164,7 +11129,7 @@
   </w:abstractNum>
   <w:abstractNum w:abstractNumId="5" w15:restartNumberingAfterBreak="0">
     <w:multiLevelType w:val="hybridMultilevel"/>
-    <w:lvl w:ilvl="0" w15:tentative="1">
+    <w:lvl w:ilvl="0" w:tentative="1">
       <w:start w:val="1"/>
       <w:numFmt w:val="decimal"/>
       <w:lvlText w:val="%1."/>
@@ -13213,6 +11178,10 @@
     </w:rPrDefault>
     <w:pPrDefault/>
   </w:docDefaults>
+  <w:style w:type="paragraph" w:styleId="Normal" w:default="1">
+    <w:name w:val="Normal"/>
+    <w:qFormat/>
+  </w:style>
   <w:style w:type="paragraph" w:styleId="Title">
     <w:name w:val="Title"/>
     <w:basedOn w:val="Normal"/>
@@ -13221,28 +11190,6 @@
     <w:rPr>
       <w:sz w:val="56"/>
       <w:szCs w:val="56"/>
-    </w:rPr>
-  </w:style>
-  <w:style w:type="paragraph" w:styleId="Heading1">
-    <w:name w:val="Heading 1"/>
-    <w:basedOn w:val="Normal"/>
-    <w:next w:val="Normal"/>
-    <w:qFormat/>
-    <w:rPr>
-      <w:color w:val="2E74B5"/>
-      <w:sz w:val="32"/>
-      <w:szCs w:val="32"/>
-    </w:rPr>
-  </w:style>
-  <w:style w:type="paragraph" w:styleId="Heading2">
-    <w:name w:val="Heading 2"/>
-    <w:basedOn w:val="Normal"/>
-    <w:next w:val="Normal"/>
-    <w:qFormat/>
-    <w:rPr>
-      <w:color w:val="2E74B5"/>
-      <w:sz w:val="26"/>
-      <w:szCs w:val="26"/>
     </w:rPr>
   </w:style>
   <w:style w:type="paragraph" w:styleId="Heading3">
@@ -13419,4 +11366,294 @@
     </w:rPr>
   </w:style>
 </w:styles>
+</file>
+
+<file path=word/theme/theme1.xml><?xml version="1.0" encoding="utf-8"?>
+<a:theme xmlns:a="http://schemas.openxmlformats.org/drawingml/2006/main" name="Office Theme">
+  <a:themeElements>
+    <a:clrScheme name="Office">
+      <a:dk1>
+        <a:sysClr val="windowText" lastClr="000000"/>
+      </a:dk1>
+      <a:lt1>
+        <a:sysClr val="window" lastClr="FFFFFF"/>
+      </a:lt1>
+      <a:dk2>
+        <a:srgbClr val="44546A"/>
+      </a:dk2>
+      <a:lt2>
+        <a:srgbClr val="E7E6E6"/>
+      </a:lt2>
+      <a:accent1>
+        <a:srgbClr val="4472C4"/>
+      </a:accent1>
+      <a:accent2>
+        <a:srgbClr val="ED7D31"/>
+      </a:accent2>
+      <a:accent3>
+        <a:srgbClr val="A5A5A5"/>
+      </a:accent3>
+      <a:accent4>
+        <a:srgbClr val="FFC000"/>
+      </a:accent4>
+      <a:accent5>
+        <a:srgbClr val="5B9BD5"/>
+      </a:accent5>
+      <a:accent6>
+        <a:srgbClr val="70AD47"/>
+      </a:accent6>
+      <a:hlink>
+        <a:srgbClr val="0563C1"/>
+      </a:hlink>
+      <a:folHlink>
+        <a:srgbClr val="954F72"/>
+      </a:folHlink>
+    </a:clrScheme>
+    <a:fontScheme name="Office">
+      <a:majorFont>
+        <a:latin typeface="Calibri Light" panose="020F0302020204030204"/>
+        <a:ea typeface=""/>
+        <a:cs typeface=""/>
+        <a:font script="Jpan" typeface="游ゴシック Light"/>
+        <a:font script="Hang" typeface="맑은 고딕"/>
+        <a:font script="Hans" typeface="等线 Light"/>
+        <a:font script="Hant" typeface="新細明體"/>
+        <a:font script="Arab" typeface="Times New Roman"/>
+        <a:font script="Hebr" typeface="Times New Roman"/>
+        <a:font script="Thai" typeface="Angsana New"/>
+        <a:font script="Ethi" typeface="Nyala"/>
+        <a:font script="Beng" typeface="Vrinda"/>
+        <a:font script="Gujr" typeface="Shruti"/>
+        <a:font script="Khmr" typeface="MoolBoran"/>
+        <a:font script="Knda" typeface="Tunga"/>
+        <a:font script="Guru" typeface="Raavi"/>
+        <a:font script="Cans" typeface="Euphemia"/>
+        <a:font script="Cher" typeface="Plantagenet Cherokee"/>
+        <a:font script="Yiii" typeface="Microsoft Yi Baiti"/>
+        <a:font script="Tibt" typeface="Microsoft Himalaya"/>
+        <a:font script="Thaa" typeface="MV Boli"/>
+        <a:font script="Deva" typeface="Mangal"/>
+        <a:font script="Telu" typeface="Gautami"/>
+        <a:font script="Taml" typeface="Latha"/>
+        <a:font script="Syrc" typeface="Estrangelo Edessa"/>
+        <a:font script="Orya" typeface="Kalinga"/>
+        <a:font script="Mlym" typeface="Kartika"/>
+        <a:font script="Laoo" typeface="DokChampa"/>
+        <a:font script="Sinh" typeface="Iskoola Pota"/>
+        <a:font script="Mong" typeface="Mongolian Baiti"/>
+        <a:font script="Viet" typeface="Times New Roman"/>
+        <a:font script="Uigh" typeface="Microsoft Uighur"/>
+        <a:font script="Geor" typeface="Sylfaen"/>
+        <a:font script="Armn" typeface="Arial"/>
+        <a:font script="Bugi" typeface="Leelawadee UI"/>
+        <a:font script="Bopo" typeface="Microsoft JhengHei"/>
+        <a:font script="Java" typeface="Javanese Text"/>
+        <a:font script="Lisu" typeface="Segoe UI"/>
+        <a:font script="Mymr" typeface="Myanmar Text"/>
+        <a:font script="Nkoo" typeface="Ebrima"/>
+        <a:font script="Olck" typeface="Nirmala UI"/>
+        <a:font script="Osma" typeface="Ebrima"/>
+        <a:font script="Phag" typeface="Phagspa"/>
+        <a:font script="Syrn" typeface="Estrangelo Edessa"/>
+        <a:font script="Syrj" typeface="Estrangelo Edessa"/>
+        <a:font script="Syre" typeface="Estrangelo Edessa"/>
+        <a:font script="Sora" typeface="Nirmala UI"/>
+        <a:font script="Tale" typeface="Microsoft Tai Le"/>
+        <a:font script="Talu" typeface="Microsoft New Tai Lue"/>
+        <a:font script="Tfng" typeface="Ebrima"/>
+      </a:majorFont>
+      <a:minorFont>
+        <a:latin typeface="Calibri" panose="020F0502020204030204"/>
+        <a:ea typeface=""/>
+        <a:cs typeface=""/>
+        <a:font script="Jpan" typeface="游明朝"/>
+        <a:font script="Hang" typeface="맑은 고딕"/>
+        <a:font script="Hans" typeface="等线"/>
+        <a:font script="Hant" typeface="新細明體"/>
+        <a:font script="Arab" typeface="Arial"/>
+        <a:font script="Hebr" typeface="Arial"/>
+        <a:font script="Thai" typeface="Cordia New"/>
+        <a:font script="Ethi" typeface="Nyala"/>
+        <a:font script="Beng" typeface="Vrinda"/>
+        <a:font script="Gujr" typeface="Shruti"/>
+        <a:font script="Khmr" typeface="DaunPenh"/>
+        <a:font script="Knda" typeface="Tunga"/>
+        <a:font script="Guru" typeface="Raavi"/>
+        <a:font script="Cans" typeface="Euphemia"/>
+        <a:font script="Cher" typeface="Plantagenet Cherokee"/>
+        <a:font script="Yiii" typeface="Microsoft Yi Baiti"/>
+        <a:font script="Tibt" typeface="Microsoft Himalaya"/>
+        <a:font script="Thaa" typeface="MV Boli"/>
+        <a:font script="Deva" typeface="Mangal"/>
+        <a:font script="Telu" typeface="Gautami"/>
+        <a:font script="Taml" typeface="Latha"/>
+        <a:font script="Syrc" typeface="Estrangelo Edessa"/>
+        <a:font script="Orya" typeface="Kalinga"/>
+        <a:font script="Mlym" typeface="Kartika"/>
+        <a:font script="Laoo" typeface="DokChampa"/>
+        <a:font script="Sinh" typeface="Iskoola Pota"/>
+        <a:font script="Mong" typeface="Mongolian Baiti"/>
+        <a:font script="Viet" typeface="Arial"/>
+        <a:font script="Uigh" typeface="Microsoft Uighur"/>
+        <a:font script="Geor" typeface="Sylfaen"/>
+        <a:font script="Armn" typeface="Arial"/>
+        <a:font script="Bugi" typeface="Leelawadee UI"/>
+        <a:font script="Bopo" typeface="Microsoft JhengHei"/>
+        <a:font script="Java" typeface="Javanese Text"/>
+        <a:font script="Lisu" typeface="Segoe UI"/>
+        <a:font script="Mymr" typeface="Myanmar Text"/>
+        <a:font script="Nkoo" typeface="Ebrima"/>
+        <a:font script="Olck" typeface="Nirmala UI"/>
+        <a:font script="Osma" typeface="Ebrima"/>
+        <a:font script="Phag" typeface="Phagspa"/>
+        <a:font script="Syrn" typeface="Estrangelo Edessa"/>
+        <a:font script="Syrj" typeface="Estrangelo Edessa"/>
+        <a:font script="Syre" typeface="Estrangelo Edessa"/>
+        <a:font script="Sora" typeface="Nirmala UI"/>
+        <a:font script="Tale" typeface="Microsoft Tai Le"/>
+        <a:font script="Talu" typeface="Microsoft New Tai Lue"/>
+        <a:font script="Tfng" typeface="Ebrima"/>
+      </a:minorFont>
+    </a:fontScheme>
+    <a:fmtScheme name="Office">
+      <a:fillStyleLst>
+        <a:solidFill>
+          <a:schemeClr val="phClr"/>
+        </a:solidFill>
+        <a:gradFill rotWithShape="true">
+          <a:gsLst>
+            <a:gs pos="0">
+              <a:schemeClr val="phClr">
+                <a:lumMod val="110000"/>
+                <a:satMod val="105000"/>
+                <a:tint val="67000"/>
+              </a:schemeClr>
+            </a:gs>
+            <a:gs pos="50000">
+              <a:schemeClr val="phClr">
+                <a:lumMod val="105000"/>
+                <a:satMod val="103000"/>
+                <a:tint val="73000"/>
+              </a:schemeClr>
+            </a:gs>
+            <a:gs pos="100000">
+              <a:schemeClr val="phClr">
+                <a:lumMod val="105000"/>
+                <a:satMod val="109000"/>
+                <a:tint val="81000"/>
+              </a:schemeClr>
+            </a:gs>
+          </a:gsLst>
+          <a:lin ang="5400000" scaled="false"/>
+        </a:gradFill>
+        <a:gradFill rotWithShape="true">
+          <a:gsLst>
+            <a:gs pos="0">
+              <a:schemeClr val="phClr">
+                <a:satMod val="103000"/>
+                <a:lumMod val="102000"/>
+                <a:tint val="94000"/>
+              </a:schemeClr>
+            </a:gs>
+            <a:gs pos="50000">
+              <a:schemeClr val="phClr">
+                <a:satMod val="110000"/>
+                <a:lumMod val="100000"/>
+                <a:shade val="100000"/>
+              </a:schemeClr>
+            </a:gs>
+            <a:gs pos="100000">
+              <a:schemeClr val="phClr">
+                <a:lumMod val="99000"/>
+                <a:satMod val="120000"/>
+                <a:shade val="78000"/>
+              </a:schemeClr>
+            </a:gs>
+          </a:gsLst>
+          <a:lin ang="5400000" scaled="false"/>
+        </a:gradFill>
+      </a:fillStyleLst>
+      <a:lnStyleLst>
+        <a:ln w="6350" cap="flat" cmpd="sng" algn="ctr">
+          <a:solidFill>
+            <a:schemeClr val="phClr"/>
+          </a:solidFill>
+          <a:prstDash val="solid"/>
+          <a:miter lim="800000"/>
+        </a:ln>
+        <a:ln w="12700" cap="flat" cmpd="sng" algn="ctr">
+          <a:solidFill>
+            <a:schemeClr val="phClr"/>
+          </a:solidFill>
+          <a:prstDash val="solid"/>
+          <a:miter lim="800000"/>
+        </a:ln>
+        <a:ln w="19050" cap="flat" cmpd="sng" algn="ctr">
+          <a:solidFill>
+            <a:schemeClr val="phClr"/>
+          </a:solidFill>
+          <a:prstDash val="solid"/>
+          <a:miter lim="800000"/>
+        </a:ln>
+      </a:lnStyleLst>
+      <a:effectStyleLst>
+        <a:effectStyle>
+          <a:effectLst/>
+        </a:effectStyle>
+        <a:effectStyle>
+          <a:effectLst/>
+        </a:effectStyle>
+        <a:effectStyle>
+          <a:effectLst>
+            <a:outerShdw blurRad="57150" dist="19050" dir="5400000" algn="ctr" rotWithShape="false">
+              <a:srgbClr val="000000">
+                <a:alpha val="63000"/>
+              </a:srgbClr>
+            </a:outerShdw>
+          </a:effectLst>
+        </a:effectStyle>
+      </a:effectStyleLst>
+      <a:bgFillStyleLst>
+        <a:solidFill>
+          <a:schemeClr val="phClr"/>
+        </a:solidFill>
+        <a:solidFill>
+          <a:schemeClr val="phClr">
+            <a:tint val="95000"/>
+            <a:satMod val="170000"/>
+          </a:schemeClr>
+        </a:solidFill>
+        <a:gradFill rotWithShape="true">
+          <a:gsLst>
+            <a:gs pos="0">
+              <a:schemeClr val="phClr">
+                <a:tint val="93000"/>
+                <a:satMod val="150000"/>
+                <a:shade val="98000"/>
+                <a:lumMod val="102000"/>
+              </a:schemeClr>
+            </a:gs>
+            <a:gs pos="50000">
+              <a:schemeClr val="phClr">
+                <a:tint val="98000"/>
+                <a:satMod val="130000"/>
+                <a:shade val="90000"/>
+                <a:lumMod val="103000"/>
+              </a:schemeClr>
+            </a:gs>
+            <a:gs pos="100000">
+              <a:schemeClr val="phClr">
+                <a:shade val="63000"/>
+                <a:satMod val="120000"/>
+              </a:schemeClr>
+            </a:gs>
+          </a:gsLst>
+          <a:lin ang="5400000" scaled="false"/>
+        </a:gradFill>
+      </a:bgFillStyleLst>
+    </a:fmtScheme>
+  </a:themeElements>
+  <a:objectDefaults/>
+  <a:extraClrSchemeLst/>
+</a:theme>
 </file>
</xml_diff>

<commit_message>
Paper, pitch and summary updated with the extensions
- Paper: Sections 4.8 (SEM image reader), 4.9 (wettability inputs), 4.10 (automated video
  measurement), abstract, contributions, discussion, conclusions; Lee et al. 2016 as [13];
  numbers read from results/extensions/summary.json; docx, pdf and text rebuilt
- Pitch: 'New since the poster' segment, website demo steps, three new answers
- Research summary section 8; project notes
</commit_message>
<xml_diff>
--- a/paper/Droplet_Spreading_Paper_v2.docx
+++ b/paper/Droplet_Spreading_Paper_v2.docx
@@ -81,7 +81,7 @@
           <w:sz w:val="18"/>
           <w:szCs w:val="18"/>
         </w:rPr>
-        <w:t xml:space="preserve">Working paper · 24 September 2026 · prepared for Interfacial Phenomena in Droplets 2026, IISc Bengaluru, 5–7 October 2026</w:t>
+        <w:t xml:space="preserve">Working paper · 24 September 2026, extended 1 October 2026 · prepared for Interfacial Phenomena in Droplets 2026, IISc Bengaluru, 5–7 October 2026</w:t>
       </w:r>
     </w:p>
     <w:p>
@@ -132,7 +132,7 @@
         <w:t xml:space="preserve">max</w:t>
       </w:r>
       <w:r>
-        <w:t xml:space="preserve"> on unseen surfaces with a root-mean-square error (RMSE) of 0.040 (mean absolute percentage error 1.1%). XGBoost on the same inputs gives 0.056 (paired surface-bootstrap 95% interval of the difference 0.006 to 0.028), and the Laan scaling law alone gives 0.250. A Laan-law backbone, a smoother kernel, a fluid–surface interaction kernel, nested model selection and a convolutional network reading SEM images each changed the error by less than 0.002, with intervals that include zero. Removing the texture descriptors raised the error to 0.046, but with only 12 surfaces that interval also includes zero. Nominal 90% prediction intervals covered 90.1% of unseen-surface impacts overall, yet 76% for water and 98% for 91 wt% glycerol. On REF-H the error rose to 0.059 and coverage fell to 62%, with the shortfall concentrated in the low-viscosity fluids. The evidence favours a simple GP. Further gains are more likely from wettability inputs, viscosity-dependent noise and more surfaces than from larger models.</w:t>
+        <w:t xml:space="preserve"> on unseen surfaces with a root-mean-square error (RMSE) of 0.040 (mean absolute percentage error 1.1%). XGBoost on the same inputs gives 0.056 (paired surface-bootstrap 95% interval of the difference 0.006 to 0.028), and the Laan scaling law alone gives 0.250. A Laan-law backbone, a smoother kernel, a fluid–surface interaction kernel, nested model selection and a convolutional network reading SEM images each changed the error by less than 0.002, with intervals that include zero. Removing the texture descriptors raised the error to 0.046, but with only 12 surfaces that interval also includes zero. Nominal 90% prediction intervals covered 90.1% of unseen-surface impacts overall, yet 76% for water and 98% for 91 wt% glycerol. On REF-H the error rose to 0.059 and coverage fell to 62%, with the shortfall concentrated in the low-viscosity fluids. Reading the flat-area fraction directly from one 43× SEM image, without channel spacing or depth, gives the same unseen-surface error (0.040) and reads the smooth plate correctly as φ = 1; adding contact angles through the Lee et al. correction or as an input does not work on this data. The evidence favours a simple GP. Further gains are more likely from wettability inputs, viscosity-dependent noise and more surfaces than from larger models.</w:t>
       </w:r>
     </w:p>
     <w:p>
@@ -460,6 +460,38 @@
       </w:r>
       <w:r>
         <w:t xml:space="preserve">.</w:t>
+      </w:r>
+    </w:p>
+    <w:p>
+      <w:pPr>
+        <w:pStyle w:val="ListParagraph"/>
+        <w:numPr>
+          <w:ilvl w:val="0"/>
+          <w:numId w:val="2"/>
+        </w:numPr>
+        <w:spacing w:after="60" w:line="276"/>
+        <w:jc w:val="left"/>
+      </w:pPr>
+      <w:r>
+        <w:t xml:space="preserve">Extensions toward new surfaces: a physical SEM reader that needs no geometry, a test of contact-angle inputs, and automated measurement of D</w:t>
+      </w:r>
+      <w:r>
+        <w:rPr>
+          <w:vertAlign w:val="subscript"/>
+        </w:rPr>
+        <w:t xml:space="preserve">0</w:t>
+      </w:r>
+      <w:r>
+        <w:t xml:space="preserve">, V and β</w:t>
+      </w:r>
+      <w:r>
+        <w:rPr>
+          <w:vertAlign w:val="subscript"/>
+        </w:rPr>
+        <w:t xml:space="preserve">max</w:t>
+      </w:r>
+      <w:r>
+        <w:t xml:space="preserve"> from impact video (Section 4.8–4.10).</w:t>
       </w:r>
     </w:p>
     <w:p>
@@ -10453,6 +10485,1295 @@
     </w:p>
     <w:p>
       <w:pPr>
+        <w:pStyle w:val="Heading2"/>
+        <w:keepNext/>
+        <w:spacing w:after="80" w:before="200"/>
+      </w:pPr>
+      <w:r>
+        <w:t xml:space="preserve">4.8 Reading the surface from one SEM image</w:t>
+      </w:r>
+    </w:p>
+    <w:p>
+      <w:pPr>
+        <w:spacing w:after="120" w:before="0" w:line="276"/>
+        <w:jc w:val="both"/>
+      </w:pPr>
+      <w:r>
+        <w:t xml:space="preserve">A surface that has not been characterised will rarely come with a channel spacing and depth. Laser tracks are rough and the plateaus between them are smooth, so the flat-area fraction can be measured directly: the local standard deviation of SEM intensity over a 12.7 µm window, with one threshold set by Otsu's method on the training surfaces only (recalibrated in every LOSO fold). Pixel size is read from the microscope metadata. On 43× images the reader gives φ = 1.000 for the smooth plate (the CNN of Section 4.2 gave 0.71) and agrees with the geometric φ within 0.12 at pitches of 200 µm and above. At 50 µm pitch it finds more flat area than the geometric formula assumes (D50: 0.22 vs 0.01). A GP on ln Re, ln We, ln D</w:t>
+      </w:r>
+      <w:r>
+        <w:rPr>
+          <w:vertAlign w:val="subscript"/>
+        </w:rPr>
+        <w:t xml:space="preserve">0</w:t>
+      </w:r>
+      <w:r>
+        <w:t xml:space="preserve"> and the image φ alone, with no spacing or depth, gives LOSO RMSE 0.040 against 0.040 for the baseline (difference interval -0.007 to 0.004) and REF-H RMSE 0.064. It is not better, so the baseline stays the default, but it is an equally accurate route for surfaces known only from an image. The reader is calibrated at 43×: at 100× and 350× it under-reads φ on textured surfaces, so the tool refuses other pixel sizes.</w:t>
+      </w:r>
+    </w:p>
+    <w:tbl>
+      <w:tblPr>
+        <w:tblW w:type="dxa" w:w="9000"/>
+        <w:jc w:val="center"/>
+        <w:tblBorders>
+          <w:top w:val="single" w:color="auto" w:sz="4"/>
+          <w:left w:val="single" w:color="auto" w:sz="4"/>
+          <w:bottom w:val="single" w:color="auto" w:sz="4"/>
+          <w:right w:val="single" w:color="auto" w:sz="4"/>
+          <w:insideH w:val="single" w:color="auto" w:sz="4"/>
+          <w:insideV w:val="single" w:color="auto" w:sz="4"/>
+        </w:tblBorders>
+      </w:tblPr>
+      <w:tblGrid>
+        <w:gridCol w:w="3000"/>
+        <w:gridCol w:w="1300"/>
+        <w:gridCol w:w="2000"/>
+        <w:gridCol w:w="1400"/>
+        <w:gridCol w:w="1300"/>
+      </w:tblGrid>
+      <w:tr>
+        <w:trPr>
+          <w:cantSplit/>
+          <w:tblHeader/>
+        </w:trPr>
+        <w:tc>
+          <w:tcPr>
+            <w:tcW w:type="dxa" w:w="3000"/>
+            <w:tcBorders>
+              <w:top w:val="single" w:color="999999" w:sz="4"/>
+              <w:left w:val="none" w:color="FFFFFF" w:sz="0"/>
+              <w:bottom w:val="single" w:color="999999" w:sz="4"/>
+              <w:right w:val="none" w:color="FFFFFF" w:sz="0"/>
+            </w:tcBorders>
+            <w:shd w:fill="E8EEF6" w:color="auto" w:val="clear"/>
+            <w:tcMar>
+              <w:top w:type="dxa" w:w="50"/>
+              <w:left w:type="dxa" w:w="90"/>
+              <w:bottom w:type="dxa" w:w="50"/>
+              <w:right w:type="dxa" w:w="90"/>
+            </w:tcMar>
+          </w:tcPr>
+          <w:p>
+            <w:pPr>
+              <w:keepNext/>
+              <w:keepLines/>
+              <w:spacing w:after="0"/>
+              <w:jc w:val="left"/>
+            </w:pPr>
+            <w:r>
+              <w:rPr>
+                <w:b/>
+                <w:bCs/>
+                <w:sz w:val="18"/>
+                <w:szCs w:val="18"/>
+              </w:rPr>
+              <w:t xml:space="preserve">Candidate</w:t>
+            </w:r>
+          </w:p>
+        </w:tc>
+        <w:tc>
+          <w:tcPr>
+            <w:tcW w:type="dxa" w:w="1300"/>
+            <w:tcBorders>
+              <w:top w:val="single" w:color="999999" w:sz="4"/>
+              <w:left w:val="none" w:color="FFFFFF" w:sz="0"/>
+              <w:bottom w:val="single" w:color="999999" w:sz="4"/>
+              <w:right w:val="none" w:color="FFFFFF" w:sz="0"/>
+            </w:tcBorders>
+            <w:shd w:fill="E8EEF6" w:color="auto" w:val="clear"/>
+            <w:tcMar>
+              <w:top w:type="dxa" w:w="50"/>
+              <w:left w:type="dxa" w:w="90"/>
+              <w:bottom w:type="dxa" w:w="50"/>
+              <w:right w:type="dxa" w:w="90"/>
+            </w:tcMar>
+          </w:tcPr>
+          <w:p>
+            <w:pPr>
+              <w:keepNext/>
+              <w:keepLines/>
+              <w:spacing w:after="0"/>
+              <w:jc w:val="right"/>
+            </w:pPr>
+            <w:r>
+              <w:rPr>
+                <w:b/>
+                <w:bCs/>
+                <w:sz w:val="18"/>
+                <w:szCs w:val="18"/>
+              </w:rPr>
+              <w:t xml:space="preserve">LOSO RMSE</w:t>
+            </w:r>
+          </w:p>
+        </w:tc>
+        <w:tc>
+          <w:tcPr>
+            <w:tcW w:type="dxa" w:w="2000"/>
+            <w:tcBorders>
+              <w:top w:val="single" w:color="999999" w:sz="4"/>
+              <w:left w:val="none" w:color="FFFFFF" w:sz="0"/>
+              <w:bottom w:val="single" w:color="999999" w:sz="4"/>
+              <w:right w:val="none" w:color="FFFFFF" w:sz="0"/>
+            </w:tcBorders>
+            <w:shd w:fill="E8EEF6" w:color="auto" w:val="clear"/>
+            <w:tcMar>
+              <w:top w:type="dxa" w:w="50"/>
+              <w:left w:type="dxa" w:w="90"/>
+              <w:bottom w:type="dxa" w:w="50"/>
+              <w:right w:type="dxa" w:w="90"/>
+            </w:tcMar>
+          </w:tcPr>
+          <w:p>
+            <w:pPr>
+              <w:keepNext/>
+              <w:keepLines/>
+              <w:spacing w:after="0"/>
+              <w:jc w:val="right"/>
+            </w:pPr>
+            <w:r>
+              <w:rPr>
+                <w:b/>
+                <w:bCs/>
+                <w:sz w:val="18"/>
+                <w:szCs w:val="18"/>
+              </w:rPr>
+              <w:t xml:space="preserve">95% CI vs baseline</w:t>
+            </w:r>
+          </w:p>
+        </w:tc>
+        <w:tc>
+          <w:tcPr>
+            <w:tcW w:type="dxa" w:w="1400"/>
+            <w:tcBorders>
+              <w:top w:val="single" w:color="999999" w:sz="4"/>
+              <w:left w:val="none" w:color="FFFFFF" w:sz="0"/>
+              <w:bottom w:val="single" w:color="999999" w:sz="4"/>
+              <w:right w:val="none" w:color="FFFFFF" w:sz="0"/>
+            </w:tcBorders>
+            <w:shd w:fill="E8EEF6" w:color="auto" w:val="clear"/>
+            <w:tcMar>
+              <w:top w:type="dxa" w:w="50"/>
+              <w:left w:type="dxa" w:w="90"/>
+              <w:bottom w:type="dxa" w:w="50"/>
+              <w:right w:type="dxa" w:w="90"/>
+            </w:tcMar>
+          </w:tcPr>
+          <w:p>
+            <w:pPr>
+              <w:keepNext/>
+              <w:keepLines/>
+              <w:spacing w:after="0"/>
+              <w:jc w:val="right"/>
+            </w:pPr>
+            <w:r>
+              <w:rPr>
+                <w:b/>
+                <w:bCs/>
+                <w:sz w:val="18"/>
+                <w:szCs w:val="18"/>
+              </w:rPr>
+              <w:t xml:space="preserve">REF-H RMSE</w:t>
+            </w:r>
+          </w:p>
+        </w:tc>
+        <w:tc>
+          <w:tcPr>
+            <w:tcW w:type="dxa" w:w="1300"/>
+            <w:tcBorders>
+              <w:top w:val="single" w:color="999999" w:sz="4"/>
+              <w:left w:val="none" w:color="FFFFFF" w:sz="0"/>
+              <w:bottom w:val="single" w:color="999999" w:sz="4"/>
+              <w:right w:val="none" w:color="FFFFFF" w:sz="0"/>
+            </w:tcBorders>
+            <w:shd w:fill="E8EEF6" w:color="auto" w:val="clear"/>
+            <w:tcMar>
+              <w:top w:type="dxa" w:w="50"/>
+              <w:left w:type="dxa" w:w="90"/>
+              <w:bottom w:type="dxa" w:w="50"/>
+              <w:right w:type="dxa" w:w="90"/>
+            </w:tcMar>
+          </w:tcPr>
+          <w:p>
+            <w:pPr>
+              <w:keepNext/>
+              <w:keepLines/>
+              <w:spacing w:after="0"/>
+              <w:jc w:val="right"/>
+            </w:pPr>
+            <w:r>
+              <w:rPr>
+                <w:b/>
+                <w:bCs/>
+                <w:sz w:val="18"/>
+                <w:szCs w:val="18"/>
+              </w:rPr>
+              <w:t xml:space="preserve">REF-H coverage</w:t>
+            </w:r>
+          </w:p>
+        </w:tc>
+      </w:tr>
+      <w:tr>
+        <w:trPr>
+          <w:cantSplit/>
+          <w:tblHeader w:val="off"/>
+        </w:trPr>
+        <w:tc>
+          <w:tcPr>
+            <w:tcW w:type="dxa" w:w="3000"/>
+            <w:tcBorders>
+              <w:top w:val="none" w:color="FFFFFF" w:sz="0"/>
+              <w:left w:val="none" w:color="FFFFFF" w:sz="0"/>
+              <w:bottom w:val="single" w:color="999999" w:sz="4"/>
+              <w:right w:val="none" w:color="FFFFFF" w:sz="0"/>
+            </w:tcBorders>
+            <w:tcMar>
+              <w:top w:type="dxa" w:w="50"/>
+              <w:left w:type="dxa" w:w="90"/>
+              <w:bottom w:type="dxa" w:w="50"/>
+              <w:right w:type="dxa" w:w="90"/>
+            </w:tcMar>
+          </w:tcPr>
+          <w:p>
+            <w:pPr>
+              <w:keepNext/>
+              <w:keepLines/>
+              <w:spacing w:after="0"/>
+              <w:jc w:val="left"/>
+            </w:pPr>
+            <w:r>
+              <w:rPr>
+                <w:b w:val="false"/>
+                <w:bCs w:val="false"/>
+                <w:sz w:val="18"/>
+                <w:szCs w:val="18"/>
+              </w:rPr>
+              <w:t xml:space="preserve">Baseline (geometry φ, V</w:t>
+            </w:r>
+            <w:r>
+              <w:rPr>
+                <w:b w:val="false"/>
+                <w:bCs w:val="false"/>
+                <w:sz w:val="18"/>
+                <w:szCs w:val="18"/>
+                <w:vertAlign w:val="subscript"/>
+              </w:rPr>
+              <w:t xml:space="preserve">tex</w:t>
+            </w:r>
+            <w:r>
+              <w:rPr>
+                <w:b w:val="false"/>
+                <w:bCs w:val="false"/>
+                <w:sz w:val="18"/>
+                <w:szCs w:val="18"/>
+              </w:rPr>
+              <w:t xml:space="preserve">)</w:t>
+            </w:r>
+          </w:p>
+        </w:tc>
+        <w:tc>
+          <w:tcPr>
+            <w:tcW w:type="dxa" w:w="1300"/>
+            <w:tcBorders>
+              <w:top w:val="none" w:color="FFFFFF" w:sz="0"/>
+              <w:left w:val="none" w:color="FFFFFF" w:sz="0"/>
+              <w:bottom w:val="single" w:color="999999" w:sz="4"/>
+              <w:right w:val="none" w:color="FFFFFF" w:sz="0"/>
+            </w:tcBorders>
+            <w:tcMar>
+              <w:top w:type="dxa" w:w="50"/>
+              <w:left w:type="dxa" w:w="90"/>
+              <w:bottom w:type="dxa" w:w="50"/>
+              <w:right w:type="dxa" w:w="90"/>
+            </w:tcMar>
+          </w:tcPr>
+          <w:p>
+            <w:pPr>
+              <w:keepNext/>
+              <w:keepLines/>
+              <w:spacing w:after="0"/>
+              <w:jc w:val="right"/>
+            </w:pPr>
+            <w:r>
+              <w:rPr>
+                <w:b w:val="false"/>
+                <w:bCs w:val="false"/>
+                <w:sz w:val="18"/>
+                <w:szCs w:val="18"/>
+              </w:rPr>
+              <w:t xml:space="preserve">0.040</w:t>
+            </w:r>
+          </w:p>
+        </w:tc>
+        <w:tc>
+          <w:tcPr>
+            <w:tcW w:type="dxa" w:w="2000"/>
+            <w:tcBorders>
+              <w:top w:val="none" w:color="FFFFFF" w:sz="0"/>
+              <w:left w:val="none" w:color="FFFFFF" w:sz="0"/>
+              <w:bottom w:val="single" w:color="999999" w:sz="4"/>
+              <w:right w:val="none" w:color="FFFFFF" w:sz="0"/>
+            </w:tcBorders>
+            <w:tcMar>
+              <w:top w:type="dxa" w:w="50"/>
+              <w:left w:type="dxa" w:w="90"/>
+              <w:bottom w:type="dxa" w:w="50"/>
+              <w:right w:type="dxa" w:w="90"/>
+            </w:tcMar>
+          </w:tcPr>
+          <w:p>
+            <w:pPr>
+              <w:keepNext/>
+              <w:keepLines/>
+              <w:spacing w:after="0"/>
+              <w:jc w:val="right"/>
+            </w:pPr>
+            <w:r>
+              <w:rPr>
+                <w:b w:val="false"/>
+                <w:bCs w:val="false"/>
+                <w:sz w:val="18"/>
+                <w:szCs w:val="18"/>
+              </w:rPr>
+              <w:t xml:space="preserve">—</w:t>
+            </w:r>
+          </w:p>
+        </w:tc>
+        <w:tc>
+          <w:tcPr>
+            <w:tcW w:type="dxa" w:w="1400"/>
+            <w:tcBorders>
+              <w:top w:val="none" w:color="FFFFFF" w:sz="0"/>
+              <w:left w:val="none" w:color="FFFFFF" w:sz="0"/>
+              <w:bottom w:val="single" w:color="999999" w:sz="4"/>
+              <w:right w:val="none" w:color="FFFFFF" w:sz="0"/>
+            </w:tcBorders>
+            <w:tcMar>
+              <w:top w:type="dxa" w:w="50"/>
+              <w:left w:type="dxa" w:w="90"/>
+              <w:bottom w:type="dxa" w:w="50"/>
+              <w:right w:type="dxa" w:w="90"/>
+            </w:tcMar>
+          </w:tcPr>
+          <w:p>
+            <w:pPr>
+              <w:keepNext/>
+              <w:keepLines/>
+              <w:spacing w:after="0"/>
+              <w:jc w:val="right"/>
+            </w:pPr>
+            <w:r>
+              <w:rPr>
+                <w:b w:val="false"/>
+                <w:bCs w:val="false"/>
+                <w:sz w:val="18"/>
+                <w:szCs w:val="18"/>
+              </w:rPr>
+              <w:t xml:space="preserve">0.059</w:t>
+            </w:r>
+          </w:p>
+        </w:tc>
+        <w:tc>
+          <w:tcPr>
+            <w:tcW w:type="dxa" w:w="1300"/>
+            <w:tcBorders>
+              <w:top w:val="none" w:color="FFFFFF" w:sz="0"/>
+              <w:left w:val="none" w:color="FFFFFF" w:sz="0"/>
+              <w:bottom w:val="single" w:color="999999" w:sz="4"/>
+              <w:right w:val="none" w:color="FFFFFF" w:sz="0"/>
+            </w:tcBorders>
+            <w:tcMar>
+              <w:top w:type="dxa" w:w="50"/>
+              <w:left w:type="dxa" w:w="90"/>
+              <w:bottom w:type="dxa" w:w="50"/>
+              <w:right w:type="dxa" w:w="90"/>
+            </w:tcMar>
+          </w:tcPr>
+          <w:p>
+            <w:pPr>
+              <w:keepNext/>
+              <w:keepLines/>
+              <w:spacing w:after="0"/>
+              <w:jc w:val="right"/>
+            </w:pPr>
+            <w:r>
+              <w:rPr>
+                <w:b w:val="false"/>
+                <w:bCs w:val="false"/>
+                <w:sz w:val="18"/>
+                <w:szCs w:val="18"/>
+              </w:rPr>
+              <w:t xml:space="preserve">62%</w:t>
+            </w:r>
+          </w:p>
+        </w:tc>
+      </w:tr>
+      <w:tr>
+        <w:trPr>
+          <w:cantSplit/>
+          <w:tblHeader w:val="off"/>
+        </w:trPr>
+        <w:tc>
+          <w:tcPr>
+            <w:tcW w:type="dxa" w:w="3000"/>
+            <w:tcBorders>
+              <w:top w:val="none" w:color="FFFFFF" w:sz="0"/>
+              <w:left w:val="none" w:color="FFFFFF" w:sz="0"/>
+              <w:bottom w:val="single" w:color="999999" w:sz="4"/>
+              <w:right w:val="none" w:color="FFFFFF" w:sz="0"/>
+            </w:tcBorders>
+            <w:tcMar>
+              <w:top w:type="dxa" w:w="50"/>
+              <w:left w:type="dxa" w:w="90"/>
+              <w:bottom w:type="dxa" w:w="50"/>
+              <w:right w:type="dxa" w:w="90"/>
+            </w:tcMar>
+          </w:tcPr>
+          <w:p>
+            <w:pPr>
+              <w:keepNext/>
+              <w:keepLines/>
+              <w:spacing w:after="0"/>
+              <w:jc w:val="left"/>
+            </w:pPr>
+            <w:r>
+              <w:rPr>
+                <w:b w:val="false"/>
+                <w:bCs w:val="false"/>
+                <w:sz w:val="18"/>
+                <w:szCs w:val="18"/>
+              </w:rPr>
+              <w:t xml:space="preserve">Image φ + V</w:t>
+            </w:r>
+            <w:r>
+              <w:rPr>
+                <w:b w:val="false"/>
+                <w:bCs w:val="false"/>
+                <w:sz w:val="18"/>
+                <w:szCs w:val="18"/>
+                <w:vertAlign w:val="subscript"/>
+              </w:rPr>
+              <w:t xml:space="preserve">tex</w:t>
+            </w:r>
+          </w:p>
+        </w:tc>
+        <w:tc>
+          <w:tcPr>
+            <w:tcW w:type="dxa" w:w="1300"/>
+            <w:tcBorders>
+              <w:top w:val="none" w:color="FFFFFF" w:sz="0"/>
+              <w:left w:val="none" w:color="FFFFFF" w:sz="0"/>
+              <w:bottom w:val="single" w:color="999999" w:sz="4"/>
+              <w:right w:val="none" w:color="FFFFFF" w:sz="0"/>
+            </w:tcBorders>
+            <w:tcMar>
+              <w:top w:type="dxa" w:w="50"/>
+              <w:left w:type="dxa" w:w="90"/>
+              <w:bottom w:type="dxa" w:w="50"/>
+              <w:right w:type="dxa" w:w="90"/>
+            </w:tcMar>
+          </w:tcPr>
+          <w:p>
+            <w:pPr>
+              <w:keepNext/>
+              <w:keepLines/>
+              <w:spacing w:after="0"/>
+              <w:jc w:val="right"/>
+            </w:pPr>
+            <w:r>
+              <w:rPr>
+                <w:b w:val="false"/>
+                <w:bCs w:val="false"/>
+                <w:sz w:val="18"/>
+                <w:szCs w:val="18"/>
+              </w:rPr>
+              <w:t xml:space="preserve">0.040</w:t>
+            </w:r>
+          </w:p>
+        </w:tc>
+        <w:tc>
+          <w:tcPr>
+            <w:tcW w:type="dxa" w:w="2000"/>
+            <w:tcBorders>
+              <w:top w:val="none" w:color="FFFFFF" w:sz="0"/>
+              <w:left w:val="none" w:color="FFFFFF" w:sz="0"/>
+              <w:bottom w:val="single" w:color="999999" w:sz="4"/>
+              <w:right w:val="none" w:color="FFFFFF" w:sz="0"/>
+            </w:tcBorders>
+            <w:tcMar>
+              <w:top w:type="dxa" w:w="50"/>
+              <w:left w:type="dxa" w:w="90"/>
+              <w:bottom w:type="dxa" w:w="50"/>
+              <w:right w:type="dxa" w:w="90"/>
+            </w:tcMar>
+          </w:tcPr>
+          <w:p>
+            <w:pPr>
+              <w:keepNext/>
+              <w:keepLines/>
+              <w:spacing w:after="0"/>
+              <w:jc w:val="right"/>
+            </w:pPr>
+            <w:r>
+              <w:rPr>
+                <w:b w:val="false"/>
+                <w:bCs w:val="false"/>
+                <w:sz w:val="18"/>
+                <w:szCs w:val="18"/>
+              </w:rPr>
+              <w:t xml:space="preserve">-0.006 to 0.005</w:t>
+            </w:r>
+          </w:p>
+        </w:tc>
+        <w:tc>
+          <w:tcPr>
+            <w:tcW w:type="dxa" w:w="1400"/>
+            <w:tcBorders>
+              <w:top w:val="none" w:color="FFFFFF" w:sz="0"/>
+              <w:left w:val="none" w:color="FFFFFF" w:sz="0"/>
+              <w:bottom w:val="single" w:color="999999" w:sz="4"/>
+              <w:right w:val="none" w:color="FFFFFF" w:sz="0"/>
+            </w:tcBorders>
+            <w:tcMar>
+              <w:top w:type="dxa" w:w="50"/>
+              <w:left w:type="dxa" w:w="90"/>
+              <w:bottom w:type="dxa" w:w="50"/>
+              <w:right w:type="dxa" w:w="90"/>
+            </w:tcMar>
+          </w:tcPr>
+          <w:p>
+            <w:pPr>
+              <w:keepNext/>
+              <w:keepLines/>
+              <w:spacing w:after="0"/>
+              <w:jc w:val="right"/>
+            </w:pPr>
+            <w:r>
+              <w:rPr>
+                <w:b w:val="false"/>
+                <w:bCs w:val="false"/>
+                <w:sz w:val="18"/>
+                <w:szCs w:val="18"/>
+              </w:rPr>
+              <w:t xml:space="preserve">0.060</w:t>
+            </w:r>
+          </w:p>
+        </w:tc>
+        <w:tc>
+          <w:tcPr>
+            <w:tcW w:type="dxa" w:w="1300"/>
+            <w:tcBorders>
+              <w:top w:val="none" w:color="FFFFFF" w:sz="0"/>
+              <w:left w:val="none" w:color="FFFFFF" w:sz="0"/>
+              <w:bottom w:val="single" w:color="999999" w:sz="4"/>
+              <w:right w:val="none" w:color="FFFFFF" w:sz="0"/>
+            </w:tcBorders>
+            <w:tcMar>
+              <w:top w:type="dxa" w:w="50"/>
+              <w:left w:type="dxa" w:w="90"/>
+              <w:bottom w:type="dxa" w:w="50"/>
+              <w:right w:type="dxa" w:w="90"/>
+            </w:tcMar>
+          </w:tcPr>
+          <w:p>
+            <w:pPr>
+              <w:keepNext/>
+              <w:keepLines/>
+              <w:spacing w:after="0"/>
+              <w:jc w:val="right"/>
+            </w:pPr>
+            <w:r>
+              <w:rPr>
+                <w:b w:val="false"/>
+                <w:bCs w:val="false"/>
+                <w:sz w:val="18"/>
+                <w:szCs w:val="18"/>
+              </w:rPr>
+              <w:t xml:space="preserve">66%</w:t>
+            </w:r>
+          </w:p>
+        </w:tc>
+      </w:tr>
+      <w:tr>
+        <w:trPr>
+          <w:cantSplit/>
+          <w:tblHeader w:val="off"/>
+        </w:trPr>
+        <w:tc>
+          <w:tcPr>
+            <w:tcW w:type="dxa" w:w="3000"/>
+            <w:tcBorders>
+              <w:top w:val="none" w:color="FFFFFF" w:sz="0"/>
+              <w:left w:val="none" w:color="FFFFFF" w:sz="0"/>
+              <w:bottom w:val="single" w:color="999999" w:sz="4"/>
+              <w:right w:val="none" w:color="FFFFFF" w:sz="0"/>
+            </w:tcBorders>
+            <w:tcMar>
+              <w:top w:type="dxa" w:w="50"/>
+              <w:left w:type="dxa" w:w="90"/>
+              <w:bottom w:type="dxa" w:w="50"/>
+              <w:right w:type="dxa" w:w="90"/>
+            </w:tcMar>
+          </w:tcPr>
+          <w:p>
+            <w:pPr>
+              <w:keepNext/>
+              <w:keepLines/>
+              <w:spacing w:after="0"/>
+              <w:jc w:val="left"/>
+            </w:pPr>
+            <w:r>
+              <w:rPr>
+                <w:b w:val="false"/>
+                <w:bCs w:val="false"/>
+                <w:sz w:val="18"/>
+                <w:szCs w:val="18"/>
+              </w:rPr>
+              <w:t xml:space="preserve">Image φ only</w:t>
+            </w:r>
+          </w:p>
+        </w:tc>
+        <w:tc>
+          <w:tcPr>
+            <w:tcW w:type="dxa" w:w="1300"/>
+            <w:tcBorders>
+              <w:top w:val="none" w:color="FFFFFF" w:sz="0"/>
+              <w:left w:val="none" w:color="FFFFFF" w:sz="0"/>
+              <w:bottom w:val="single" w:color="999999" w:sz="4"/>
+              <w:right w:val="none" w:color="FFFFFF" w:sz="0"/>
+            </w:tcBorders>
+            <w:tcMar>
+              <w:top w:type="dxa" w:w="50"/>
+              <w:left w:type="dxa" w:w="90"/>
+              <w:bottom w:type="dxa" w:w="50"/>
+              <w:right w:type="dxa" w:w="90"/>
+            </w:tcMar>
+          </w:tcPr>
+          <w:p>
+            <w:pPr>
+              <w:keepNext/>
+              <w:keepLines/>
+              <w:spacing w:after="0"/>
+              <w:jc w:val="right"/>
+            </w:pPr>
+            <w:r>
+              <w:rPr>
+                <w:b w:val="false"/>
+                <w:bCs w:val="false"/>
+                <w:sz w:val="18"/>
+                <w:szCs w:val="18"/>
+              </w:rPr>
+              <w:t xml:space="preserve">0.040</w:t>
+            </w:r>
+          </w:p>
+        </w:tc>
+        <w:tc>
+          <w:tcPr>
+            <w:tcW w:type="dxa" w:w="2000"/>
+            <w:tcBorders>
+              <w:top w:val="none" w:color="FFFFFF" w:sz="0"/>
+              <w:left w:val="none" w:color="FFFFFF" w:sz="0"/>
+              <w:bottom w:val="single" w:color="999999" w:sz="4"/>
+              <w:right w:val="none" w:color="FFFFFF" w:sz="0"/>
+            </w:tcBorders>
+            <w:tcMar>
+              <w:top w:type="dxa" w:w="50"/>
+              <w:left w:type="dxa" w:w="90"/>
+              <w:bottom w:type="dxa" w:w="50"/>
+              <w:right w:type="dxa" w:w="90"/>
+            </w:tcMar>
+          </w:tcPr>
+          <w:p>
+            <w:pPr>
+              <w:keepNext/>
+              <w:keepLines/>
+              <w:spacing w:after="0"/>
+              <w:jc w:val="right"/>
+            </w:pPr>
+            <w:r>
+              <w:rPr>
+                <w:b w:val="false"/>
+                <w:bCs w:val="false"/>
+                <w:sz w:val="18"/>
+                <w:szCs w:val="18"/>
+              </w:rPr>
+              <w:t xml:space="preserve">-0.007 to 0.004</w:t>
+            </w:r>
+          </w:p>
+        </w:tc>
+        <w:tc>
+          <w:tcPr>
+            <w:tcW w:type="dxa" w:w="1400"/>
+            <w:tcBorders>
+              <w:top w:val="none" w:color="FFFFFF" w:sz="0"/>
+              <w:left w:val="none" w:color="FFFFFF" w:sz="0"/>
+              <w:bottom w:val="single" w:color="999999" w:sz="4"/>
+              <w:right w:val="none" w:color="FFFFFF" w:sz="0"/>
+            </w:tcBorders>
+            <w:tcMar>
+              <w:top w:type="dxa" w:w="50"/>
+              <w:left w:type="dxa" w:w="90"/>
+              <w:bottom w:type="dxa" w:w="50"/>
+              <w:right w:type="dxa" w:w="90"/>
+            </w:tcMar>
+          </w:tcPr>
+          <w:p>
+            <w:pPr>
+              <w:keepNext/>
+              <w:keepLines/>
+              <w:spacing w:after="0"/>
+              <w:jc w:val="right"/>
+            </w:pPr>
+            <w:r>
+              <w:rPr>
+                <w:b w:val="false"/>
+                <w:bCs w:val="false"/>
+                <w:sz w:val="18"/>
+                <w:szCs w:val="18"/>
+              </w:rPr>
+              <w:t xml:space="preserve">0.064</w:t>
+            </w:r>
+          </w:p>
+        </w:tc>
+        <w:tc>
+          <w:tcPr>
+            <w:tcW w:type="dxa" w:w="1300"/>
+            <w:tcBorders>
+              <w:top w:val="none" w:color="FFFFFF" w:sz="0"/>
+              <w:left w:val="none" w:color="FFFFFF" w:sz="0"/>
+              <w:bottom w:val="single" w:color="999999" w:sz="4"/>
+              <w:right w:val="none" w:color="FFFFFF" w:sz="0"/>
+            </w:tcBorders>
+            <w:tcMar>
+              <w:top w:type="dxa" w:w="50"/>
+              <w:left w:type="dxa" w:w="90"/>
+              <w:bottom w:type="dxa" w:w="50"/>
+              <w:right w:type="dxa" w:w="90"/>
+            </w:tcMar>
+          </w:tcPr>
+          <w:p>
+            <w:pPr>
+              <w:keepNext/>
+              <w:keepLines/>
+              <w:spacing w:after="0"/>
+              <w:jc w:val="right"/>
+            </w:pPr>
+            <w:r>
+              <w:rPr>
+                <w:b w:val="false"/>
+                <w:bCs w:val="false"/>
+                <w:sz w:val="18"/>
+                <w:szCs w:val="18"/>
+              </w:rPr>
+              <w:t xml:space="preserve">62%</w:t>
+            </w:r>
+          </w:p>
+        </w:tc>
+      </w:tr>
+      <w:tr>
+        <w:trPr>
+          <w:cantSplit/>
+          <w:tblHeader w:val="off"/>
+        </w:trPr>
+        <w:tc>
+          <w:tcPr>
+            <w:tcW w:type="dxa" w:w="3000"/>
+            <w:tcBorders>
+              <w:top w:val="none" w:color="FFFFFF" w:sz="0"/>
+              <w:left w:val="none" w:color="FFFFFF" w:sz="0"/>
+              <w:bottom w:val="single" w:color="999999" w:sz="4"/>
+              <w:right w:val="none" w:color="FFFFFF" w:sz="0"/>
+            </w:tcBorders>
+            <w:tcMar>
+              <w:top w:type="dxa" w:w="50"/>
+              <w:left w:type="dxa" w:w="90"/>
+              <w:bottom w:type="dxa" w:w="50"/>
+              <w:right w:type="dxa" w:w="90"/>
+            </w:tcMar>
+          </w:tcPr>
+          <w:p>
+            <w:pPr>
+              <w:keepNext/>
+              <w:keepLines/>
+              <w:spacing w:after="0"/>
+              <w:jc w:val="left"/>
+            </w:pPr>
+            <w:r>
+              <w:rPr>
+                <w:b w:val="false"/>
+                <w:bCs w:val="false"/>
+                <w:sz w:val="18"/>
+                <w:szCs w:val="18"/>
+              </w:rPr>
+              <w:t xml:space="preserve">Lee β</w:t>
+            </w:r>
+            <w:r>
+              <w:rPr>
+                <w:b w:val="false"/>
+                <w:bCs w:val="false"/>
+                <w:sz w:val="18"/>
+                <w:szCs w:val="18"/>
+                <w:vertAlign w:val="subscript"/>
+              </w:rPr>
+              <w:t xml:space="preserve">0</w:t>
+            </w:r>
+            <w:r>
+              <w:rPr>
+                <w:b w:val="false"/>
+                <w:bCs w:val="false"/>
+                <w:sz w:val="18"/>
+                <w:szCs w:val="18"/>
+              </w:rPr>
+              <w:t xml:space="preserve"> correction</w:t>
+            </w:r>
+          </w:p>
+        </w:tc>
+        <w:tc>
+          <w:tcPr>
+            <w:tcW w:type="dxa" w:w="1300"/>
+            <w:tcBorders>
+              <w:top w:val="none" w:color="FFFFFF" w:sz="0"/>
+              <w:left w:val="none" w:color="FFFFFF" w:sz="0"/>
+              <w:bottom w:val="single" w:color="999999" w:sz="4"/>
+              <w:right w:val="none" w:color="FFFFFF" w:sz="0"/>
+            </w:tcBorders>
+            <w:tcMar>
+              <w:top w:type="dxa" w:w="50"/>
+              <w:left w:type="dxa" w:w="90"/>
+              <w:bottom w:type="dxa" w:w="50"/>
+              <w:right w:type="dxa" w:w="90"/>
+            </w:tcMar>
+          </w:tcPr>
+          <w:p>
+            <w:pPr>
+              <w:keepNext/>
+              <w:keepLines/>
+              <w:spacing w:after="0"/>
+              <w:jc w:val="right"/>
+            </w:pPr>
+            <w:r>
+              <w:rPr>
+                <w:b w:val="false"/>
+                <w:bCs w:val="false"/>
+                <w:sz w:val="18"/>
+                <w:szCs w:val="18"/>
+              </w:rPr>
+              <w:t xml:space="preserve">0.040</w:t>
+            </w:r>
+          </w:p>
+        </w:tc>
+        <w:tc>
+          <w:tcPr>
+            <w:tcW w:type="dxa" w:w="2000"/>
+            <w:tcBorders>
+              <w:top w:val="none" w:color="FFFFFF" w:sz="0"/>
+              <w:left w:val="none" w:color="FFFFFF" w:sz="0"/>
+              <w:bottom w:val="single" w:color="999999" w:sz="4"/>
+              <w:right w:val="none" w:color="FFFFFF" w:sz="0"/>
+            </w:tcBorders>
+            <w:tcMar>
+              <w:top w:type="dxa" w:w="50"/>
+              <w:left w:type="dxa" w:w="90"/>
+              <w:bottom w:type="dxa" w:w="50"/>
+              <w:right w:type="dxa" w:w="90"/>
+            </w:tcMar>
+          </w:tcPr>
+          <w:p>
+            <w:pPr>
+              <w:keepNext/>
+              <w:keepLines/>
+              <w:spacing w:after="0"/>
+              <w:jc w:val="right"/>
+            </w:pPr>
+            <w:r>
+              <w:rPr>
+                <w:b w:val="false"/>
+                <w:bCs w:val="false"/>
+                <w:sz w:val="18"/>
+                <w:szCs w:val="18"/>
+              </w:rPr>
+              <w:t xml:space="preserve">-0.001 to 0.001</w:t>
+            </w:r>
+          </w:p>
+        </w:tc>
+        <w:tc>
+          <w:tcPr>
+            <w:tcW w:type="dxa" w:w="1400"/>
+            <w:tcBorders>
+              <w:top w:val="none" w:color="FFFFFF" w:sz="0"/>
+              <w:left w:val="none" w:color="FFFFFF" w:sz="0"/>
+              <w:bottom w:val="single" w:color="999999" w:sz="4"/>
+              <w:right w:val="none" w:color="FFFFFF" w:sz="0"/>
+            </w:tcBorders>
+            <w:tcMar>
+              <w:top w:type="dxa" w:w="50"/>
+              <w:left w:type="dxa" w:w="90"/>
+              <w:bottom w:type="dxa" w:w="50"/>
+              <w:right w:type="dxa" w:w="90"/>
+            </w:tcMar>
+          </w:tcPr>
+          <w:p>
+            <w:pPr>
+              <w:keepNext/>
+              <w:keepLines/>
+              <w:spacing w:after="0"/>
+              <w:jc w:val="right"/>
+            </w:pPr>
+            <w:r>
+              <w:rPr>
+                <w:b w:val="false"/>
+                <w:bCs w:val="false"/>
+                <w:sz w:val="18"/>
+                <w:szCs w:val="18"/>
+              </w:rPr>
+              <w:t xml:space="preserve">0.228</w:t>
+            </w:r>
+          </w:p>
+        </w:tc>
+        <w:tc>
+          <w:tcPr>
+            <w:tcW w:type="dxa" w:w="1300"/>
+            <w:tcBorders>
+              <w:top w:val="none" w:color="FFFFFF" w:sz="0"/>
+              <w:left w:val="none" w:color="FFFFFF" w:sz="0"/>
+              <w:bottom w:val="single" w:color="999999" w:sz="4"/>
+              <w:right w:val="none" w:color="FFFFFF" w:sz="0"/>
+            </w:tcBorders>
+            <w:tcMar>
+              <w:top w:type="dxa" w:w="50"/>
+              <w:left w:type="dxa" w:w="90"/>
+              <w:bottom w:type="dxa" w:w="50"/>
+              <w:right w:type="dxa" w:w="90"/>
+            </w:tcMar>
+          </w:tcPr>
+          <w:p>
+            <w:pPr>
+              <w:keepNext/>
+              <w:keepLines/>
+              <w:spacing w:after="0"/>
+              <w:jc w:val="right"/>
+            </w:pPr>
+            <w:r>
+              <w:rPr>
+                <w:b w:val="false"/>
+                <w:bCs w:val="false"/>
+                <w:sz w:val="18"/>
+                <w:szCs w:val="18"/>
+              </w:rPr>
+              <w:t xml:space="preserve">1%</w:t>
+            </w:r>
+          </w:p>
+        </w:tc>
+      </w:tr>
+      <w:tr>
+        <w:trPr>
+          <w:cantSplit/>
+          <w:tblHeader w:val="off"/>
+        </w:trPr>
+        <w:tc>
+          <w:tcPr>
+            <w:tcW w:type="dxa" w:w="3000"/>
+            <w:tcBorders>
+              <w:top w:val="none" w:color="FFFFFF" w:sz="0"/>
+              <w:left w:val="none" w:color="FFFFFF" w:sz="0"/>
+              <w:bottom w:val="single" w:color="999999" w:sz="4"/>
+              <w:right w:val="none" w:color="FFFFFF" w:sz="0"/>
+            </w:tcBorders>
+            <w:tcMar>
+              <w:top w:type="dxa" w:w="50"/>
+              <w:left w:type="dxa" w:w="90"/>
+              <w:bottom w:type="dxa" w:w="50"/>
+              <w:right w:type="dxa" w:w="90"/>
+            </w:tcMar>
+          </w:tcPr>
+          <w:p>
+            <w:pPr>
+              <w:keepNext w:val="false"/>
+              <w:keepLines/>
+              <w:spacing w:after="0"/>
+              <w:jc w:val="left"/>
+            </w:pPr>
+            <w:r>
+              <w:rPr>
+                <w:b w:val="false"/>
+                <w:bCs w:val="false"/>
+                <w:sz w:val="18"/>
+                <w:szCs w:val="18"/>
+              </w:rPr>
+              <w:t xml:space="preserve">Contact angle as input</w:t>
+            </w:r>
+          </w:p>
+        </w:tc>
+        <w:tc>
+          <w:tcPr>
+            <w:tcW w:type="dxa" w:w="1300"/>
+            <w:tcBorders>
+              <w:top w:val="none" w:color="FFFFFF" w:sz="0"/>
+              <w:left w:val="none" w:color="FFFFFF" w:sz="0"/>
+              <w:bottom w:val="single" w:color="999999" w:sz="4"/>
+              <w:right w:val="none" w:color="FFFFFF" w:sz="0"/>
+            </w:tcBorders>
+            <w:tcMar>
+              <w:top w:type="dxa" w:w="50"/>
+              <w:left w:type="dxa" w:w="90"/>
+              <w:bottom w:type="dxa" w:w="50"/>
+              <w:right w:type="dxa" w:w="90"/>
+            </w:tcMar>
+          </w:tcPr>
+          <w:p>
+            <w:pPr>
+              <w:keepNext w:val="false"/>
+              <w:keepLines/>
+              <w:spacing w:after="0"/>
+              <w:jc w:val="right"/>
+            </w:pPr>
+            <w:r>
+              <w:rPr>
+                <w:b w:val="false"/>
+                <w:bCs w:val="false"/>
+                <w:sz w:val="18"/>
+                <w:szCs w:val="18"/>
+              </w:rPr>
+              <w:t xml:space="preserve">0.048</w:t>
+            </w:r>
+          </w:p>
+        </w:tc>
+        <w:tc>
+          <w:tcPr>
+            <w:tcW w:type="dxa" w:w="2000"/>
+            <w:tcBorders>
+              <w:top w:val="none" w:color="FFFFFF" w:sz="0"/>
+              <w:left w:val="none" w:color="FFFFFF" w:sz="0"/>
+              <w:bottom w:val="single" w:color="999999" w:sz="4"/>
+              <w:right w:val="none" w:color="FFFFFF" w:sz="0"/>
+            </w:tcBorders>
+            <w:tcMar>
+              <w:top w:type="dxa" w:w="50"/>
+              <w:left w:type="dxa" w:w="90"/>
+              <w:bottom w:type="dxa" w:w="50"/>
+              <w:right w:type="dxa" w:w="90"/>
+            </w:tcMar>
+          </w:tcPr>
+          <w:p>
+            <w:pPr>
+              <w:keepNext w:val="false"/>
+              <w:keepLines/>
+              <w:spacing w:after="0"/>
+              <w:jc w:val="right"/>
+            </w:pPr>
+            <w:r>
+              <w:rPr>
+                <w:b w:val="false"/>
+                <w:bCs w:val="false"/>
+                <w:sz w:val="18"/>
+                <w:szCs w:val="18"/>
+              </w:rPr>
+              <w:t xml:space="preserve">0.000 to 0.017</w:t>
+            </w:r>
+          </w:p>
+        </w:tc>
+        <w:tc>
+          <w:tcPr>
+            <w:tcW w:type="dxa" w:w="1400"/>
+            <w:tcBorders>
+              <w:top w:val="none" w:color="FFFFFF" w:sz="0"/>
+              <w:left w:val="none" w:color="FFFFFF" w:sz="0"/>
+              <w:bottom w:val="single" w:color="999999" w:sz="4"/>
+              <w:right w:val="none" w:color="FFFFFF" w:sz="0"/>
+            </w:tcBorders>
+            <w:tcMar>
+              <w:top w:type="dxa" w:w="50"/>
+              <w:left w:type="dxa" w:w="90"/>
+              <w:bottom w:type="dxa" w:w="50"/>
+              <w:right w:type="dxa" w:w="90"/>
+            </w:tcMar>
+          </w:tcPr>
+          <w:p>
+            <w:pPr>
+              <w:keepNext w:val="false"/>
+              <w:keepLines/>
+              <w:spacing w:after="0"/>
+              <w:jc w:val="right"/>
+            </w:pPr>
+            <w:r>
+              <w:rPr>
+                <w:b w:val="false"/>
+                <w:bCs w:val="false"/>
+                <w:sz w:val="18"/>
+                <w:szCs w:val="18"/>
+              </w:rPr>
+              <w:t xml:space="preserve">0.377</w:t>
+            </w:r>
+          </w:p>
+        </w:tc>
+        <w:tc>
+          <w:tcPr>
+            <w:tcW w:type="dxa" w:w="1300"/>
+            <w:tcBorders>
+              <w:top w:val="none" w:color="FFFFFF" w:sz="0"/>
+              <w:left w:val="none" w:color="FFFFFF" w:sz="0"/>
+              <w:bottom w:val="single" w:color="999999" w:sz="4"/>
+              <w:right w:val="none" w:color="FFFFFF" w:sz="0"/>
+            </w:tcBorders>
+            <w:tcMar>
+              <w:top w:type="dxa" w:w="50"/>
+              <w:left w:type="dxa" w:w="90"/>
+              <w:bottom w:type="dxa" w:w="50"/>
+              <w:right w:type="dxa" w:w="90"/>
+            </w:tcMar>
+          </w:tcPr>
+          <w:p>
+            <w:pPr>
+              <w:keepNext w:val="false"/>
+              <w:keepLines/>
+              <w:spacing w:after="0"/>
+              <w:jc w:val="right"/>
+            </w:pPr>
+            <w:r>
+              <w:rPr>
+                <w:b w:val="false"/>
+                <w:bCs w:val="false"/>
+                <w:sz w:val="18"/>
+                <w:szCs w:val="18"/>
+              </w:rPr>
+              <w:t xml:space="preserve">100%</w:t>
+            </w:r>
+          </w:p>
+        </w:tc>
+      </w:tr>
+    </w:tbl>
+    <w:p>
+      <w:pPr>
+        <w:pStyle w:val="Heading2"/>
+        <w:keepNext/>
+        <w:spacing w:after="80" w:before="200"/>
+      </w:pPr>
+      <w:r>
+        <w:t xml:space="preserve">4.9 Wettability inputs</w:t>
+      </w:r>
+    </w:p>
+    <w:p>
+      <w:pPr>
+        <w:spacing w:after="120" w:before="0" w:line="276"/>
+        <w:jc w:val="both"/>
+      </w:pPr>
+      <w:r>
+        <w:t xml:space="preserve">Two ways of adding the water advancing angle (file 03 of [4]) were tested; REF-H has no measured angle, so 114.5° from a similar smooth coating was assumed and swept from 100° to 130°. The Lee et al. [13] correction, fitting the GP to (β</w:t>
+      </w:r>
+      <w:r>
+        <w:rPr>
+          <w:vertAlign w:val="subscript"/>
+        </w:rPr>
+        <w:t xml:space="preserve">max</w:t>
+      </w:r>
+      <w:r>
+        <w:rPr>
+          <w:vertAlign w:val="superscript"/>
+        </w:rPr>
+        <w:t xml:space="preserve">2</w:t>
+      </w:r>
+      <w:r>
+        <w:t xml:space="preserve"> − β</w:t>
+      </w:r>
+      <w:r>
+        <w:rPr>
+          <w:vertAlign w:val="subscript"/>
+        </w:rPr>
+        <w:t xml:space="preserve">0</w:t>
+      </w:r>
+      <w:r>
+        <w:rPr>
+          <w:vertAlign w:val="superscript"/>
+        </w:rPr>
+        <w:t xml:space="preserve">2</w:t>
+      </w:r>
+      <w:r>
+        <w:t xml:space="preserve">)</w:t>
+      </w:r>
+      <w:r>
+        <w:rPr>
+          <w:vertAlign w:val="superscript"/>
+        </w:rPr>
+        <w:t xml:space="preserve">1/2</w:t>
+      </w:r>
+      <w:r>
+        <w:t xml:space="preserve"> with β</w:t>
+      </w:r>
+      <w:r>
+        <w:rPr>
+          <w:vertAlign w:val="subscript"/>
+        </w:rPr>
+        <w:t xml:space="preserve">0</w:t>
+      </w:r>
+      <w:r>
+        <w:t xml:space="preserve"> from the spherical cap, leaves LOSO unchanged (0.040) but over-predicts REF-H by 0.22 (RMSE 0.228), and still by 0.14 at 130°. Using cos θ as a sixth input worsens LOSO to 0.048 (interval excludes zero) and extrapolates badly on REF-H. The training angles span only about 160–167°, so this data cannot teach a wettability effect; the measured smooth-plate spreading is close to the textured surfaces, not to the Lee prediction. Surfaces with intermediate angles are needed.</w:t>
+      </w:r>
+    </w:p>
+    <w:p>
+      <w:pPr>
+        <w:pStyle w:val="Heading2"/>
+        <w:keepNext/>
+        <w:spacing w:after="80" w:before="200"/>
+      </w:pPr>
+      <w:r>
+        <w:t xml:space="preserve">4.10 Automated measurement from impact video</w:t>
+      </w:r>
+    </w:p>
+    <w:p>
+      <w:pPr>
+        <w:spacing w:after="120" w:before="0" w:line="276"/>
+        <w:jc w:val="both"/>
+      </w:pPr>
+      <w:r>
+        <w:t xml:space="preserve">To use the model without manual image analysis, a pipeline measures each backlit side-view recording automatically: one Otsu threshold separates the dark drop and substrate from the bright background; the substrate is the dark band spanning the frame; D</w:t>
+      </w:r>
+      <w:r>
+        <w:rPr>
+          <w:vertAlign w:val="subscript"/>
+        </w:rPr>
+        <w:t xml:space="preserve">0</w:t>
+      </w:r>
+      <w:r>
+        <w:t xml:space="preserve"> follows from the drop area and V from a straight-line fit of its centroid before contact; the spreading diameter is the largest horizontal extent after contact. The GP then predicts β</w:t>
+      </w:r>
+      <w:r>
+        <w:rPr>
+          <w:vertAlign w:val="subscript"/>
+        </w:rPr>
+        <w:t xml:space="preserve">max</w:t>
+      </w:r>
+      <w:r>
+        <w:t xml:space="preserve"> from the measured D</w:t>
+      </w:r>
+      <w:r>
+        <w:rPr>
+          <w:vertAlign w:val="subscript"/>
+        </w:rPr>
+        <w:t xml:space="preserve">0</w:t>
+      </w:r>
+      <w:r>
+        <w:t xml:space="preserve"> and V, and the measurement is checked against the 90% interval. A watch mode processes every new video in a folder. On synthetic videos with known answers the pipeline recovers D</w:t>
+      </w:r>
+      <w:r>
+        <w:rPr>
+          <w:vertAlign w:val="subscript"/>
+        </w:rPr>
+        <w:t xml:space="preserve">0</w:t>
+      </w:r>
+      <w:r>
+        <w:t xml:space="preserve"> and V to within 0.4% and β</w:t>
+      </w:r>
+      <w:r>
+        <w:rPr>
+          <w:vertAlign w:val="subscript"/>
+        </w:rPr>
+        <w:t xml:space="preserve">max</w:t>
+      </w:r>
+      <w:r>
+        <w:t xml:space="preserve"> to within about 1%; a browser version gives identical results. Validation on real recordings with known values is the next step; the fluorescence videos of a related liquid-film study were not suitable (no visible drop edge, no scale).</w:t>
+      </w:r>
+    </w:p>
+    <w:p>
+      <w:pPr>
         <w:pStyle w:val="Heading1"/>
         <w:keepNext/>
         <w:spacing w:after="120" w:before="280"/>
@@ -10522,7 +11843,7 @@
         <w:t xml:space="preserve">The smooth plate.</w:t>
       </w:r>
       <w:r>
-        <w:t xml:space="preserve"> REF-H is hydrophobic, not superhydrophobic, and φ = 1 lies outside the textured range. No input describes wettability, so the model cannot know that a drop on REF-H may meet a different contact-line condition. The fact that REF-H errors appear in the same low-viscosity fluids where texture matters most supports wettability as the missing input. Measured advancing and receding angles for every fluid–surface pair are the most direct fix.</w:t>
+        <w:t xml:space="preserve"> REF-H is hydrophobic, not superhydrophobic, and φ = 1 lies outside the textured range. No input describes wettability, so the model cannot know that a drop on REF-H may meet a different contact-line condition. The fact that REF-H errors appear in the same low-viscosity fluids where texture matters most supports wettability as the missing input. Section 4.9 shows that the advancing angles in the dataset are too uniform to learn this from, so new surfaces with intermediate angles are needed. Measured advancing and receding angles for every fluid–surface pair are the most direct fix.</w:t>
       </w:r>
     </w:p>
     <w:p>
@@ -10571,6 +11892,15 @@
     </w:p>
     <w:p>
       <w:pPr>
+        <w:spacing w:after="120" w:before="0" w:line="276"/>
+        <w:jc w:val="both"/>
+      </w:pPr>
+      <w:r>
+        <w:t xml:space="preserve">For surfaces described only by an SEM image, reading φ from the image gives the same accuracy (0.040), and automatic video measurement makes the model usable on new experiments without manual analysis.</w:t>
+      </w:r>
+    </w:p>
+    <w:p>
+      <w:pPr>
         <w:pStyle w:val="Heading1"/>
         <w:keepNext/>
         <w:spacing w:after="120" w:before="280"/>
@@ -10585,7 +11915,7 @@
         <w:jc w:val="both"/>
       </w:pPr>
       <w:r>
-        <w:t xml:space="preserve">Impact data: Može et al., Mendeley Data, doi:10.17632/wsh8rxwd38.1 [4]. The analysis code, trained model bundles, all fold-level predictions, the browser predictor and the tests are in the Droplet Intelligence v2.1 package accompanying this paper. The two ablations added here (Laan law alone; GP without descriptors) and the figures are reproduced by ablation.py and figs.py.</w:t>
+        <w:t xml:space="preserve">Impact data: Može et al., Mendeley Data, doi:10.17632/wsh8rxwd38.1 [4]. The analysis code, trained model bundles, all fold-level predictions, the browser predictor and the tests are in the Droplet Intelligence v2.1 package accompanying this paper. The two ablations added here (Laan law alone; GP without descriptors) and the figures are reproduced by ablation.py and figs.py. The extensions of Sections 4.8–4.10 are in droplet/extensions.py, droplet/predict_image.py and droplet/video.py, with results in results/extensions/.</w:t>
       </w:r>
     </w:p>
     <w:p>
@@ -10893,6 +12223,30 @@
       </w:r>
       <w:r>
         <w:t xml:space="preserve"> 40 (2017) 913–929.</w:t>
+      </w:r>
+    </w:p>
+    <w:p>
+      <w:pPr>
+        <w:pStyle w:val="ListParagraph"/>
+        <w:numPr>
+          <w:ilvl w:val="0"/>
+          <w:numId w:val="4"/>
+        </w:numPr>
+        <w:spacing w:after="60" w:line="276"/>
+        <w:jc w:val="left"/>
+      </w:pPr>
+      <w:r>
+        <w:t xml:space="preserve">J. B. Lee, N. Laan, K. G. de Bruin, G. Skantzaris, N. Shahidzadeh, D. Derome, J. Carmeliet, D. Bonn. Universal rescaling of drop impact on smooth and rough surfaces. </w:t>
+      </w:r>
+      <w:r>
+        <w:rPr>
+          <w:i/>
+          <w:iCs/>
+        </w:rPr>
+        <w:t xml:space="preserve">Journal of Fluid Mechanics</w:t>
+      </w:r>
+      <w:r>
+        <w:t xml:space="preserve"> 786 (2016) R4.</w:t>
       </w:r>
     </w:p>
     <w:sectPr>

</xml_diff>